<commit_message>
feat: reemplazar plantilla acta de entrega en develop
</commit_message>
<xml_diff>
--- a/pesaje/develop/Report/PrintActaEntrega.docx
+++ b/pesaje/develop/Report/PrintActaEntrega.docx
@@ -590,6 +590,8 @@
             </w:pPr>
             <w:r>
               <w:rPr>
+                <w:b/>
+                <w:bCs/>
                 <w:sz w:val="18"/>
                 <w:szCs w:val="18"/>
               </w:rPr>
@@ -597,6 +599,8 @@
             </w:r>
             <w:r>
               <w:rPr>
+                <w:b/>
+                <w:bCs/>
                 <w:sz w:val="18"/>
                 <w:szCs w:val="18"/>
               </w:rPr>
@@ -604,6 +608,8 @@
             </w:r>
             <w:r>
               <w:rPr>
+                <w:b/>
+                <w:bCs/>
                 <w:sz w:val="18"/>
                 <w:szCs w:val="18"/>
               </w:rPr>
@@ -611,6 +617,8 @@
             </w:r>
             <w:r>
               <w:rPr>
+                <w:b/>
+                <w:bCs/>
                 <w:noProof/>
                 <w:sz w:val="18"/>
                 <w:szCs w:val="18"/>
@@ -619,6 +627,8 @@
             </w:r>
             <w:r>
               <w:rPr>
+                <w:b/>
+                <w:bCs/>
                 <w:sz w:val="18"/>
                 <w:szCs w:val="18"/>
               </w:rPr>
@@ -780,6 +790,8 @@
             </w:pPr>
             <w:r>
               <w:rPr>
+                <w:b/>
+                <w:bCs/>
                 <w:sz w:val="18"/>
                 <w:szCs w:val="18"/>
               </w:rPr>
@@ -787,6 +799,8 @@
             </w:r>
             <w:r>
               <w:rPr>
+                <w:b/>
+                <w:bCs/>
                 <w:sz w:val="18"/>
                 <w:szCs w:val="18"/>
               </w:rPr>
@@ -794,6 +808,8 @@
             </w:r>
             <w:r>
               <w:rPr>
+                <w:b/>
+                <w:bCs/>
                 <w:sz w:val="18"/>
                 <w:szCs w:val="18"/>
               </w:rPr>
@@ -801,6 +817,8 @@
             </w:r>
             <w:r>
               <w:rPr>
+                <w:b/>
+                <w:bCs/>
                 <w:noProof/>
                 <w:sz w:val="18"/>
                 <w:szCs w:val="18"/>
@@ -809,6 +827,8 @@
             </w:r>
             <w:r>
               <w:rPr>
+                <w:b/>
+                <w:bCs/>
                 <w:sz w:val="18"/>
                 <w:szCs w:val="18"/>
               </w:rPr>
@@ -1195,7 +1215,6 @@
               <w:rPr>
                 <w:rFonts w:ascii="Calibri" w:hAnsi="Calibri" w:cs="Calibri"/>
                 <w:b/>
-                <w:bCs/>
                 <w:sz w:val="16"/>
                 <w:szCs w:val="16"/>
               </w:rPr>
@@ -1257,6 +1276,7 @@
             <w:r>
               <w:rPr>
                 <w:rFonts w:ascii="Calibri" w:hAnsi="Calibri" w:cs="Calibri"/>
+                <w:b/>
                 <w:sz w:val="16"/>
                 <w:szCs w:val="16"/>
               </w:rPr>
@@ -1265,6 +1285,7 @@
             <w:r>
               <w:rPr>
                 <w:rFonts w:ascii="Calibri" w:hAnsi="Calibri" w:cs="Calibri"/>
+                <w:b/>
                 <w:sz w:val="16"/>
                 <w:szCs w:val="16"/>
               </w:rPr>
@@ -1273,6 +1294,7 @@
             <w:r>
               <w:rPr>
                 <w:rFonts w:ascii="Calibri" w:hAnsi="Calibri" w:cs="Calibri"/>
+                <w:b/>
                 <w:sz w:val="16"/>
                 <w:szCs w:val="16"/>
               </w:rPr>
@@ -1281,6 +1303,7 @@
             <w:r>
               <w:rPr>
                 <w:rFonts w:ascii="Calibri" w:hAnsi="Calibri" w:cs="Calibri"/>
+                <w:b/>
                 <w:sz w:val="16"/>
                 <w:szCs w:val="16"/>
               </w:rPr>
@@ -1289,6 +1312,7 @@
             <w:r>
               <w:rPr>
                 <w:rFonts w:ascii="Calibri" w:hAnsi="Calibri" w:cs="Calibri"/>
+                <w:b/>
                 <w:sz w:val="16"/>
                 <w:szCs w:val="16"/>
               </w:rPr>
@@ -1309,49 +1333,53 @@
               <w:rPr>
                 <w:rFonts w:ascii="Calibri" w:hAnsi="Calibri" w:cs="Calibri"/>
                 <w:b/>
-                <w:bCs/>
-                <w:sz w:val="16"/>
-                <w:szCs w:val="16"/>
+                <w:sz w:val="18"/>
+                <w:szCs w:val="18"/>
               </w:rPr>
             </w:pPr>
             <w:r>
               <w:rPr>
                 <w:rFonts w:ascii="Calibri" w:hAnsi="Calibri" w:cs="Calibri"/>
-                <w:sz w:val="16"/>
-                <w:szCs w:val="16"/>
+                <w:b/>
+                <w:sz w:val="18"/>
+                <w:szCs w:val="18"/>
               </w:rPr>
               <w:fldChar w:fldCharType="begin"/>
             </w:r>
             <w:r>
               <w:rPr>
                 <w:rFonts w:ascii="Calibri" w:hAnsi="Calibri" w:cs="Calibri"/>
-                <w:sz w:val="16"/>
-                <w:szCs w:val="16"/>
+                <w:b/>
+                <w:sz w:val="18"/>
+                <w:szCs w:val="18"/>
               </w:rPr>
               <w:instrText xml:space="preserve"> MERGEFIELD  nro_lote  \* MERGEFORMAT </w:instrText>
             </w:r>
             <w:r>
               <w:rPr>
                 <w:rFonts w:ascii="Calibri" w:hAnsi="Calibri" w:cs="Calibri"/>
-                <w:sz w:val="16"/>
-                <w:szCs w:val="16"/>
+                <w:b/>
+                <w:sz w:val="18"/>
+                <w:szCs w:val="18"/>
               </w:rPr>
               <w:fldChar w:fldCharType="separate"/>
             </w:r>
             <w:r>
               <w:rPr>
                 <w:rFonts w:ascii="Calibri" w:hAnsi="Calibri" w:cs="Calibri"/>
+                <w:b/>
                 <w:noProof/>
-                <w:sz w:val="16"/>
-                <w:szCs w:val="16"/>
+                <w:sz w:val="18"/>
+                <w:szCs w:val="18"/>
               </w:rPr>
               <w:t>«nro_lote»</w:t>
             </w:r>
             <w:r>
               <w:rPr>
                 <w:rFonts w:ascii="Calibri" w:hAnsi="Calibri" w:cs="Calibri"/>
-                <w:sz w:val="16"/>
-                <w:szCs w:val="16"/>
+                <w:b/>
+                <w:sz w:val="18"/>
+                <w:szCs w:val="18"/>
               </w:rPr>
               <w:fldChar w:fldCharType="end"/>
             </w:r>
@@ -1370,7 +1398,6 @@
               <w:rPr>
                 <w:rFonts w:ascii="Calibri" w:hAnsi="Calibri" w:cs="Calibri"/>
                 <w:b/>
-                <w:bCs/>
                 <w:sz w:val="16"/>
                 <w:szCs w:val="16"/>
               </w:rPr>
@@ -1378,6 +1405,7 @@
             <w:r>
               <w:rPr>
                 <w:rFonts w:ascii="Calibri" w:hAnsi="Calibri" w:cs="Calibri"/>
+                <w:b/>
                 <w:sz w:val="16"/>
                 <w:szCs w:val="16"/>
               </w:rPr>
@@ -1386,6 +1414,7 @@
             <w:r>
               <w:rPr>
                 <w:rFonts w:ascii="Calibri" w:hAnsi="Calibri" w:cs="Calibri"/>
+                <w:b/>
                 <w:sz w:val="16"/>
                 <w:szCs w:val="16"/>
               </w:rPr>
@@ -1394,6 +1423,7 @@
             <w:r>
               <w:rPr>
                 <w:rFonts w:ascii="Calibri" w:hAnsi="Calibri" w:cs="Calibri"/>
+                <w:b/>
                 <w:sz w:val="16"/>
                 <w:szCs w:val="16"/>
               </w:rPr>
@@ -1402,6 +1432,7 @@
             <w:r>
               <w:rPr>
                 <w:rFonts w:ascii="Calibri" w:hAnsi="Calibri" w:cs="Calibri"/>
+                <w:b/>
                 <w:noProof/>
                 <w:sz w:val="16"/>
                 <w:szCs w:val="16"/>
@@ -1411,6 +1442,7 @@
             <w:r>
               <w:rPr>
                 <w:rFonts w:ascii="Calibri" w:hAnsi="Calibri" w:cs="Calibri"/>
+                <w:b/>
                 <w:sz w:val="16"/>
                 <w:szCs w:val="16"/>
               </w:rPr>
@@ -1622,6 +1654,8 @@
             <w:r>
               <w:rPr>
                 <w:rFonts w:ascii="Calibri" w:hAnsi="Calibri" w:cs="Calibri"/>
+                <w:b/>
+                <w:bCs/>
                 <w:sz w:val="16"/>
                 <w:szCs w:val="16"/>
               </w:rPr>
@@ -1630,6 +1664,8 @@
             <w:r>
               <w:rPr>
                 <w:rFonts w:ascii="Calibri" w:hAnsi="Calibri" w:cs="Calibri"/>
+                <w:b/>
+                <w:bCs/>
                 <w:sz w:val="16"/>
                 <w:szCs w:val="16"/>
               </w:rPr>
@@ -1638,6 +1674,8 @@
             <w:r>
               <w:rPr>
                 <w:rFonts w:ascii="Calibri" w:hAnsi="Calibri" w:cs="Calibri"/>
+                <w:b/>
+                <w:bCs/>
                 <w:sz w:val="16"/>
                 <w:szCs w:val="16"/>
               </w:rPr>
@@ -1646,6 +1684,8 @@
             <w:r>
               <w:rPr>
                 <w:rFonts w:ascii="Calibri" w:hAnsi="Calibri" w:cs="Calibri"/>
+                <w:b/>
+                <w:bCs/>
                 <w:noProof/>
                 <w:sz w:val="16"/>
                 <w:szCs w:val="16"/>
@@ -1655,6 +1695,8 @@
             <w:r>
               <w:rPr>
                 <w:rFonts w:ascii="Calibri" w:hAnsi="Calibri" w:cs="Calibri"/>
+                <w:b/>
+                <w:bCs/>
                 <w:sz w:val="16"/>
                 <w:szCs w:val="16"/>
               </w:rPr>
@@ -1684,6 +1726,8 @@
             <w:r>
               <w:rPr>
                 <w:rFonts w:ascii="Calibri" w:hAnsi="Calibri" w:cs="Calibri"/>
+                <w:b/>
+                <w:bCs/>
                 <w:sz w:val="16"/>
                 <w:szCs w:val="16"/>
               </w:rPr>
@@ -1692,6 +1736,8 @@
             <w:r>
               <w:rPr>
                 <w:rFonts w:ascii="Calibri" w:hAnsi="Calibri" w:cs="Calibri"/>
+                <w:b/>
+                <w:bCs/>
                 <w:sz w:val="16"/>
                 <w:szCs w:val="16"/>
               </w:rPr>
@@ -1700,6 +1746,8 @@
             <w:r>
               <w:rPr>
                 <w:rFonts w:ascii="Calibri" w:hAnsi="Calibri" w:cs="Calibri"/>
+                <w:b/>
+                <w:bCs/>
                 <w:sz w:val="16"/>
                 <w:szCs w:val="16"/>
               </w:rPr>
@@ -1708,6 +1756,8 @@
             <w:r>
               <w:rPr>
                 <w:rFonts w:ascii="Calibri" w:hAnsi="Calibri" w:cs="Calibri"/>
+                <w:b/>
+                <w:bCs/>
                 <w:noProof/>
                 <w:sz w:val="16"/>
                 <w:szCs w:val="16"/>
@@ -1717,6 +1767,8 @@
             <w:r>
               <w:rPr>
                 <w:rFonts w:ascii="Calibri" w:hAnsi="Calibri" w:cs="Calibri"/>
+                <w:b/>
+                <w:bCs/>
                 <w:sz w:val="16"/>
                 <w:szCs w:val="16"/>
               </w:rPr>
@@ -2036,8 +2088,8 @@
                 <w:rFonts w:ascii="Calibri" w:hAnsi="Calibri" w:cs="Calibri"/>
                 <w:b/>
                 <w:bCs/>
-                <w:sz w:val="18"/>
-                <w:szCs w:val="18"/>
+                <w:sz w:val="22"/>
+                <w:szCs w:val="22"/>
               </w:rPr>
             </w:pPr>
             <w:r>
@@ -2045,8 +2097,8 @@
                 <w:rFonts w:ascii="Calibri" w:hAnsi="Calibri" w:cs="Calibri"/>
                 <w:b/>
                 <w:bCs/>
-                <w:sz w:val="18"/>
-                <w:szCs w:val="18"/>
+                <w:sz w:val="22"/>
+                <w:szCs w:val="22"/>
               </w:rPr>
               <w:fldChar w:fldCharType="begin"/>
             </w:r>
@@ -2055,8 +2107,8 @@
                 <w:rFonts w:ascii="Calibri" w:hAnsi="Calibri" w:cs="Calibri"/>
                 <w:b/>
                 <w:bCs/>
-                <w:sz w:val="18"/>
-                <w:szCs w:val="18"/>
+                <w:sz w:val="22"/>
+                <w:szCs w:val="22"/>
               </w:rPr>
               <w:instrText xml:space="preserve"> MERGEFIELD  tt  \* MERGEFORMAT </w:instrText>
             </w:r>
@@ -2065,8 +2117,8 @@
                 <w:rFonts w:ascii="Calibri" w:hAnsi="Calibri" w:cs="Calibri"/>
                 <w:b/>
                 <w:bCs/>
-                <w:sz w:val="18"/>
-                <w:szCs w:val="18"/>
+                <w:sz w:val="22"/>
+                <w:szCs w:val="22"/>
               </w:rPr>
               <w:fldChar w:fldCharType="separate"/>
             </w:r>
@@ -2076,8 +2128,8 @@
                 <w:b/>
                 <w:bCs/>
                 <w:noProof/>
-                <w:sz w:val="18"/>
-                <w:szCs w:val="18"/>
+                <w:sz w:val="22"/>
+                <w:szCs w:val="22"/>
               </w:rPr>
               <w:t>«tt»</w:t>
             </w:r>
@@ -2086,8 +2138,8 @@
                 <w:rFonts w:ascii="Calibri" w:hAnsi="Calibri" w:cs="Calibri"/>
                 <w:b/>
                 <w:bCs/>
-                <w:sz w:val="18"/>
-                <w:szCs w:val="18"/>
+                <w:sz w:val="22"/>
+                <w:szCs w:val="22"/>
               </w:rPr>
               <w:fldChar w:fldCharType="end"/>
             </w:r>
@@ -2110,8 +2162,8 @@
                 <w:rFonts w:ascii="Black Han Sans" w:eastAsia="Black Han Sans" w:hAnsi="Calibri" w:cs="Calibri"/>
                 <w:b/>
                 <w:bCs/>
-                <w:sz w:val="18"/>
-                <w:szCs w:val="18"/>
+                <w:sz w:val="22"/>
+                <w:szCs w:val="22"/>
               </w:rPr>
             </w:pPr>
             <w:r>
@@ -2119,8 +2171,8 @@
                 <w:rFonts w:ascii="Calibri" w:hAnsi="Calibri" w:cs="Calibri"/>
                 <w:b/>
                 <w:bCs/>
-                <w:sz w:val="18"/>
-                <w:szCs w:val="18"/>
+                <w:sz w:val="22"/>
+                <w:szCs w:val="22"/>
               </w:rPr>
               <w:fldChar w:fldCharType="begin"/>
             </w:r>
@@ -2129,8 +2181,8 @@
                 <w:rFonts w:ascii="Calibri" w:hAnsi="Calibri" w:cs="Calibri"/>
                 <w:b/>
                 <w:bCs/>
-                <w:sz w:val="18"/>
-                <w:szCs w:val="18"/>
+                <w:sz w:val="22"/>
+                <w:szCs w:val="22"/>
               </w:rPr>
               <w:instrText xml:space="preserve"> MERGEFIELD  t.bigbag  \* MERGEFORMAT </w:instrText>
             </w:r>
@@ -2139,8 +2191,8 @@
                 <w:rFonts w:ascii="Calibri" w:hAnsi="Calibri" w:cs="Calibri"/>
                 <w:b/>
                 <w:bCs/>
-                <w:sz w:val="18"/>
-                <w:szCs w:val="18"/>
+                <w:sz w:val="22"/>
+                <w:szCs w:val="22"/>
               </w:rPr>
               <w:fldChar w:fldCharType="separate"/>
             </w:r>
@@ -2150,8 +2202,8 @@
                 <w:b/>
                 <w:bCs/>
                 <w:noProof/>
-                <w:sz w:val="18"/>
-                <w:szCs w:val="18"/>
+                <w:sz w:val="22"/>
+                <w:szCs w:val="22"/>
               </w:rPr>
               <w:t>«t.bigbag»</w:t>
             </w:r>
@@ -2160,8 +2212,8 @@
                 <w:rFonts w:ascii="Calibri" w:hAnsi="Calibri" w:cs="Calibri"/>
                 <w:b/>
                 <w:bCs/>
-                <w:sz w:val="18"/>
-                <w:szCs w:val="18"/>
+                <w:sz w:val="22"/>
+                <w:szCs w:val="22"/>
               </w:rPr>
               <w:fldChar w:fldCharType="end"/>
             </w:r>
@@ -2184,8 +2236,8 @@
                 <w:rFonts w:ascii="Aptos Black" w:hAnsi="Aptos Black" w:cs="Calibri"/>
                 <w:b/>
                 <w:bCs/>
-                <w:sz w:val="18"/>
-                <w:szCs w:val="18"/>
+                <w:sz w:val="22"/>
+                <w:szCs w:val="22"/>
               </w:rPr>
             </w:pPr>
             <w:r>
@@ -2193,8 +2245,8 @@
                 <w:rFonts w:ascii="Calibri" w:hAnsi="Calibri" w:cs="Calibri"/>
                 <w:b/>
                 <w:bCs/>
-                <w:sz w:val="18"/>
-                <w:szCs w:val="18"/>
+                <w:sz w:val="22"/>
+                <w:szCs w:val="22"/>
               </w:rPr>
               <w:fldChar w:fldCharType="begin"/>
             </w:r>
@@ -2203,8 +2255,8 @@
                 <w:rFonts w:ascii="Calibri" w:hAnsi="Calibri" w:cs="Calibri"/>
                 <w:b/>
                 <w:bCs/>
-                <w:sz w:val="18"/>
-                <w:szCs w:val="18"/>
+                <w:sz w:val="22"/>
+                <w:szCs w:val="22"/>
               </w:rPr>
               <w:instrText xml:space="preserve"> MERGEFIELD  t.granel  \* MERGEFORMAT </w:instrText>
             </w:r>
@@ -2213,8 +2265,8 @@
                 <w:rFonts w:ascii="Calibri" w:hAnsi="Calibri" w:cs="Calibri"/>
                 <w:b/>
                 <w:bCs/>
-                <w:sz w:val="18"/>
-                <w:szCs w:val="18"/>
+                <w:sz w:val="22"/>
+                <w:szCs w:val="22"/>
               </w:rPr>
               <w:fldChar w:fldCharType="separate"/>
             </w:r>
@@ -2224,8 +2276,8 @@
                 <w:b/>
                 <w:bCs/>
                 <w:noProof/>
-                <w:sz w:val="18"/>
-                <w:szCs w:val="18"/>
+                <w:sz w:val="22"/>
+                <w:szCs w:val="22"/>
               </w:rPr>
               <w:t>«t.granel»</w:t>
             </w:r>
@@ -2234,8 +2286,8 @@
                 <w:rFonts w:ascii="Calibri" w:hAnsi="Calibri" w:cs="Calibri"/>
                 <w:b/>
                 <w:bCs/>
-                <w:sz w:val="18"/>
-                <w:szCs w:val="18"/>
+                <w:sz w:val="22"/>
+                <w:szCs w:val="22"/>
               </w:rPr>
               <w:fldChar w:fldCharType="end"/>
             </w:r>
@@ -2302,47 +2354,59 @@
                 <w:rFonts w:ascii="Aptos Black" w:hAnsi="Aptos Black" w:cs="Calibri"/>
                 <w:b/>
                 <w:bCs/>
+                <w:sz w:val="22"/>
+                <w:szCs w:val="22"/>
                 <w:u w:val="single"/>
               </w:rPr>
             </w:pPr>
             <w:r>
               <w:rPr>
                 <w:rFonts w:ascii="Calibri" w:hAnsi="Calibri" w:cs="Calibri"/>
-                <w:sz w:val="16"/>
-                <w:szCs w:val="16"/>
+                <w:b/>
+                <w:bCs/>
+                <w:sz w:val="22"/>
+                <w:szCs w:val="22"/>
               </w:rPr>
               <w:fldChar w:fldCharType="begin"/>
             </w:r>
             <w:r>
               <w:rPr>
                 <w:rFonts w:ascii="Calibri" w:hAnsi="Calibri" w:cs="Calibri"/>
-                <w:sz w:val="16"/>
-                <w:szCs w:val="16"/>
+                <w:b/>
+                <w:bCs/>
+                <w:sz w:val="22"/>
+                <w:szCs w:val="22"/>
               </w:rPr>
               <w:instrText xml:space="preserve"> MERGEFIELD  t.contramuestra  \* MERGEFORMAT </w:instrText>
             </w:r>
             <w:r>
               <w:rPr>
                 <w:rFonts w:ascii="Calibri" w:hAnsi="Calibri" w:cs="Calibri"/>
-                <w:sz w:val="16"/>
-                <w:szCs w:val="16"/>
+                <w:b/>
+                <w:bCs/>
+                <w:sz w:val="22"/>
+                <w:szCs w:val="22"/>
               </w:rPr>
               <w:fldChar w:fldCharType="separate"/>
             </w:r>
             <w:r>
               <w:rPr>
                 <w:rFonts w:ascii="Calibri" w:hAnsi="Calibri" w:cs="Calibri"/>
+                <w:b/>
+                <w:bCs/>
                 <w:noProof/>
-                <w:sz w:val="16"/>
-                <w:szCs w:val="16"/>
+                <w:sz w:val="22"/>
+                <w:szCs w:val="22"/>
               </w:rPr>
               <w:t>«t.contramuestra»</w:t>
             </w:r>
             <w:r>
               <w:rPr>
                 <w:rFonts w:ascii="Calibri" w:hAnsi="Calibri" w:cs="Calibri"/>
-                <w:sz w:val="16"/>
-                <w:szCs w:val="16"/>
+                <w:b/>
+                <w:bCs/>
+                <w:sz w:val="22"/>
+                <w:szCs w:val="22"/>
               </w:rPr>
               <w:fldChar w:fldCharType="end"/>
             </w:r>
@@ -2500,20 +2564,6 @@
           <w:szCs w:val="2"/>
         </w:rPr>
       </w:pPr>
-    </w:p>
-    <w:p>
-      <w:pPr>
-        <w:spacing w:before="0" w:after="0"/>
-        <w:ind w:firstLine="142"/>
-        <w:rPr>
-          <w:rFonts w:ascii="Calibri" w:hAnsi="Calibri" w:cs="Calibri"/>
-          <w:b/>
-          <w:caps/>
-          <w:noProof/>
-          <w:sz w:val="2"/>
-          <w:szCs w:val="2"/>
-        </w:rPr>
-      </w:pPr>
       <w:r>
         <w:rPr>
           <w:rFonts w:ascii="Calibri" w:hAnsi="Calibri" w:cs="Calibri"/>
@@ -2525,18 +2575,18 @@
         <mc:AlternateContent>
           <mc:Choice Requires="wps">
             <w:drawing>
-              <wp:anchor distT="0" distB="0" distL="114300" distR="114300" simplePos="0" relativeHeight="251662336" behindDoc="0" locked="0" layoutInCell="1" allowOverlap="1" wp14:anchorId="2CDD55FC" wp14:editId="783AB342">
+              <wp:anchor distT="0" distB="0" distL="114300" distR="114300" simplePos="0" relativeHeight="251683840" behindDoc="0" locked="0" layoutInCell="1" allowOverlap="1" wp14:anchorId="5990CF46" wp14:editId="599786B0">
                 <wp:simplePos x="0" y="0"/>
                 <wp:positionH relativeFrom="column">
-                  <wp:posOffset>4258310</wp:posOffset>
+                  <wp:posOffset>92710</wp:posOffset>
                 </wp:positionH>
                 <wp:positionV relativeFrom="paragraph">
-                  <wp:posOffset>6985</wp:posOffset>
+                  <wp:posOffset>1905</wp:posOffset>
                 </wp:positionV>
-                <wp:extent cx="2934970" cy="1109980"/>
+                <wp:extent cx="3905250" cy="1016000"/>
                 <wp:effectExtent l="0" t="0" r="0" b="0"/>
-                <wp:wrapSquare wrapText="bothSides"/>
-                <wp:docPr id="1992824391" name="Rectángulo 2"/>
+                <wp:wrapTopAndBottom/>
+                <wp:docPr id="821845427" name="Rectángulo 2"/>
                 <wp:cNvGraphicFramePr/>
                 <a:graphic xmlns:a="http://schemas.openxmlformats.org/drawingml/2006/main">
                   <a:graphicData uri="http://schemas.microsoft.com/office/word/2010/wordprocessingShape">
@@ -2545,7 +2595,7 @@
                       <wps:spPr>
                         <a:xfrm>
                           <a:off x="0" y="0"/>
-                          <a:ext cx="2934970" cy="1109980"/>
+                          <a:ext cx="3905250" cy="1016000"/>
                         </a:xfrm>
                         <a:prstGeom prst="rect">
                           <a:avLst/>
@@ -2574,19 +2624,26 @@
                           <w:tbl>
                             <w:tblPr>
                               <w:tblStyle w:val="Tablaconcuadrcula"/>
-                              <w:tblW w:w="0" w:type="auto"/>
+                              <w:tblW w:w="6374" w:type="dxa"/>
+                              <w:tblLayout w:type="fixed"/>
                               <w:tblLook w:val="04A0" w:firstRow="1" w:lastRow="0" w:firstColumn="1" w:lastColumn="0" w:noHBand="0" w:noVBand="1"/>
                             </w:tblPr>
                             <w:tblGrid>
-                              <w:gridCol w:w="988"/>
-                              <w:gridCol w:w="1097"/>
-                              <w:gridCol w:w="1171"/>
-                              <w:gridCol w:w="1067"/>
+                              <w:gridCol w:w="942"/>
+                              <w:gridCol w:w="1321"/>
+                              <w:gridCol w:w="1231"/>
+                              <w:gridCol w:w="1321"/>
+                              <w:gridCol w:w="387"/>
+                              <w:gridCol w:w="1172"/>
                             </w:tblGrid>
                             <w:tr>
+                              <w:trPr>
+                                <w:gridAfter w:val="2"/>
+                                <w:wAfter w:w="1559" w:type="dxa"/>
+                              </w:trPr>
                               <w:tc>
                                 <w:tcPr>
-                                  <w:tcW w:w="4294" w:type="dxa"/>
+                                  <w:tcW w:w="4815" w:type="dxa"/>
                                   <w:gridSpan w:val="4"/>
                                   <w:tcBorders>
                                     <w:right w:val="single" w:sz="4" w:space="0" w:color="auto"/>
@@ -2599,6 +2656,7 @@
                                     <w:rPr>
                                       <w:rFonts w:ascii="Calibri" w:hAnsi="Calibri" w:cs="Calibri"/>
                                       <w:b/>
+                                      <w:bCs/>
                                       <w:caps/>
                                       <w:noProof/>
                                       <w:sz w:val="18"/>
@@ -2607,6 +2665,8 @@
                                   </w:pPr>
                                   <w:r>
                                     <w:rPr>
+                                      <w:b/>
+                                      <w:bCs/>
                                       <w:sz w:val="18"/>
                                       <w:szCs w:val="18"/>
                                     </w:rPr>
@@ -2614,13 +2674,17 @@
                                   </w:r>
                                   <w:r>
                                     <w:rPr>
+                                      <w:b/>
+                                      <w:bCs/>
                                       <w:sz w:val="18"/>
                                       <w:szCs w:val="18"/>
                                     </w:rPr>
-                                    <w:instrText xml:space="preserve"> MERGEFIELD  placa2  \* MERGEFORMAT </w:instrText>
+                                    <w:instrText xml:space="preserve"> MERGEFIELD  placa1  \* MERGEFORMAT </w:instrText>
                                   </w:r>
                                   <w:r>
                                     <w:rPr>
+                                      <w:b/>
+                                      <w:bCs/>
                                       <w:sz w:val="18"/>
                                       <w:szCs w:val="18"/>
                                     </w:rPr>
@@ -2628,14 +2692,18 @@
                                   </w:r>
                                   <w:r>
                                     <w:rPr>
+                                      <w:b/>
+                                      <w:bCs/>
                                       <w:noProof/>
                                       <w:sz w:val="18"/>
                                       <w:szCs w:val="18"/>
                                     </w:rPr>
-                                    <w:t>«placa2»</w:t>
+                                    <w:t>«placa1»</w:t>
                                   </w:r>
                                   <w:r>
                                     <w:rPr>
+                                      <w:b/>
+                                      <w:bCs/>
                                       <w:sz w:val="18"/>
                                       <w:szCs w:val="18"/>
                                     </w:rPr>
@@ -2645,9 +2713,16 @@
                               </w:tc>
                             </w:tr>
                             <w:tr>
+                              <w:trPr>
+                                <w:gridAfter w:val="2"/>
+                                <w:wAfter w:w="1559" w:type="dxa"/>
+                              </w:trPr>
                               <w:tc>
                                 <w:tcPr>
-                                  <w:tcW w:w="988" w:type="dxa"/>
+                                  <w:tcW w:w="942" w:type="dxa"/>
+                                  <w:tcBorders>
+                                    <w:bottom w:val="single" w:sz="4" w:space="0" w:color="auto"/>
+                                  </w:tcBorders>
                                 </w:tcPr>
                                 <w:p>
                                   <w:pPr>
@@ -2677,7 +2752,10 @@
                               </w:tc>
                               <w:tc>
                                 <w:tcPr>
-                                  <w:tcW w:w="1097" w:type="dxa"/>
+                                  <w:tcW w:w="1321" w:type="dxa"/>
+                                  <w:tcBorders>
+                                    <w:bottom w:val="single" w:sz="4" w:space="0" w:color="auto"/>
+                                  </w:tcBorders>
                                 </w:tcPr>
                                 <w:p>
                                   <w:pPr>
@@ -2707,7 +2785,10 @@
                               </w:tc>
                               <w:tc>
                                 <w:tcPr>
-                                  <w:tcW w:w="1171" w:type="dxa"/>
+                                  <w:tcW w:w="1231" w:type="dxa"/>
+                                  <w:tcBorders>
+                                    <w:bottom w:val="single" w:sz="4" w:space="0" w:color="auto"/>
+                                  </w:tcBorders>
                                 </w:tcPr>
                                 <w:p>
                                   <w:pPr>
@@ -2737,8 +2818,9 @@
                               </w:tc>
                               <w:tc>
                                 <w:tcPr>
-                                  <w:tcW w:w="1038" w:type="dxa"/>
+                                  <w:tcW w:w="1321" w:type="dxa"/>
                                   <w:tcBorders>
+                                    <w:bottom w:val="single" w:sz="4" w:space="0" w:color="auto"/>
                                     <w:right w:val="single" w:sz="4" w:space="0" w:color="auto"/>
                                   </w:tcBorders>
                                 </w:tcPr>
@@ -2770,9 +2852,16 @@
                               </w:tc>
                             </w:tr>
                             <w:tr>
+                              <w:trPr>
+                                <w:gridAfter w:val="2"/>
+                                <w:wAfter w:w="1559" w:type="dxa"/>
+                              </w:trPr>
                               <w:tc>
                                 <w:tcPr>
-                                  <w:tcW w:w="988" w:type="dxa"/>
+                                  <w:tcW w:w="942" w:type="dxa"/>
+                                  <w:tcBorders>
+                                    <w:bottom w:val="single" w:sz="4" w:space="0" w:color="auto"/>
+                                  </w:tcBorders>
                                 </w:tcPr>
                                 <w:p>
                                   <w:pPr>
@@ -2807,7 +2896,7 @@
                                       <w:sz w:val="2"/>
                                       <w:szCs w:val="2"/>
                                     </w:rPr>
-                                    <w:instrText xml:space="preserve"> MERGEFIELD  TableStart:placas2 \* Lower  \* MERGEFORMAT </w:instrText>
+                                    <w:instrText xml:space="preserve"> MERGEFIELD  TableStart:placas1 \* Lower  \* MERGEFORMAT </w:instrText>
                                   </w:r>
                                   <w:r>
                                     <w:rPr>
@@ -2828,7 +2917,7 @@
                                       <w:sz w:val="2"/>
                                       <w:szCs w:val="2"/>
                                     </w:rPr>
-                                    <w:t>«tablestart:placas2»</w:t>
+                                    <w:t>«tablestart:placas1»</w:t>
                                   </w:r>
                                   <w:r>
                                     <w:rPr>
@@ -2844,6 +2933,7 @@
                                   <w:r>
                                     <w:rPr>
                                       <w:rFonts w:ascii="Calibri" w:hAnsi="Calibri" w:cs="Calibri"/>
+                                      <w:b/>
                                       <w:sz w:val="18"/>
                                       <w:szCs w:val="18"/>
                                     </w:rPr>
@@ -2852,6 +2942,7 @@
                                   <w:r>
                                     <w:rPr>
                                       <w:rFonts w:ascii="Calibri" w:hAnsi="Calibri" w:cs="Calibri"/>
+                                      <w:b/>
                                       <w:sz w:val="18"/>
                                       <w:szCs w:val="18"/>
                                     </w:rPr>
@@ -2860,6 +2951,7 @@
                                   <w:r>
                                     <w:rPr>
                                       <w:rFonts w:ascii="Calibri" w:hAnsi="Calibri" w:cs="Calibri"/>
+                                      <w:b/>
                                       <w:sz w:val="18"/>
                                       <w:szCs w:val="18"/>
                                     </w:rPr>
@@ -2868,6 +2960,7 @@
                                   <w:r>
                                     <w:rPr>
                                       <w:rFonts w:ascii="Calibri" w:hAnsi="Calibri" w:cs="Calibri"/>
+                                      <w:b/>
                                       <w:noProof/>
                                       <w:sz w:val="18"/>
                                       <w:szCs w:val="18"/>
@@ -2877,6 +2970,7 @@
                                   <w:r>
                                     <w:rPr>
                                       <w:rFonts w:ascii="Calibri" w:hAnsi="Calibri" w:cs="Calibri"/>
+                                      <w:b/>
                                       <w:sz w:val="18"/>
                                       <w:szCs w:val="18"/>
                                     </w:rPr>
@@ -2886,7 +2980,10 @@
                               </w:tc>
                               <w:tc>
                                 <w:tcPr>
-                                  <w:tcW w:w="1097" w:type="dxa"/>
+                                  <w:tcW w:w="1321" w:type="dxa"/>
+                                  <w:tcBorders>
+                                    <w:bottom w:val="single" w:sz="4" w:space="0" w:color="auto"/>
+                                  </w:tcBorders>
                                 </w:tcPr>
                                 <w:p>
                                   <w:pPr>
@@ -2904,6 +3001,7 @@
                                   <w:r>
                                     <w:rPr>
                                       <w:rFonts w:ascii="Calibri" w:hAnsi="Calibri" w:cs="Calibri"/>
+                                      <w:b/>
                                       <w:sz w:val="18"/>
                                       <w:szCs w:val="18"/>
                                     </w:rPr>
@@ -2912,6 +3010,7 @@
                                   <w:r>
                                     <w:rPr>
                                       <w:rFonts w:ascii="Calibri" w:hAnsi="Calibri" w:cs="Calibri"/>
+                                      <w:b/>
                                       <w:sz w:val="18"/>
                                       <w:szCs w:val="18"/>
                                     </w:rPr>
@@ -2920,6 +3019,7 @@
                                   <w:r>
                                     <w:rPr>
                                       <w:rFonts w:ascii="Calibri" w:hAnsi="Calibri" w:cs="Calibri"/>
+                                      <w:b/>
                                       <w:sz w:val="18"/>
                                       <w:szCs w:val="18"/>
                                     </w:rPr>
@@ -2928,6 +3028,7 @@
                                   <w:r>
                                     <w:rPr>
                                       <w:rFonts w:ascii="Calibri" w:hAnsi="Calibri" w:cs="Calibri"/>
+                                      <w:b/>
                                       <w:noProof/>
                                       <w:sz w:val="18"/>
                                       <w:szCs w:val="18"/>
@@ -2937,6 +3038,7 @@
                                   <w:r>
                                     <w:rPr>
                                       <w:rFonts w:ascii="Calibri" w:hAnsi="Calibri" w:cs="Calibri"/>
+                                      <w:b/>
                                       <w:sz w:val="18"/>
                                       <w:szCs w:val="18"/>
                                     </w:rPr>
@@ -2946,7 +3048,10 @@
                               </w:tc>
                               <w:tc>
                                 <w:tcPr>
-                                  <w:tcW w:w="1171" w:type="dxa"/>
+                                  <w:tcW w:w="1231" w:type="dxa"/>
+                                  <w:tcBorders>
+                                    <w:bottom w:val="single" w:sz="4" w:space="0" w:color="auto"/>
+                                  </w:tcBorders>
                                 </w:tcPr>
                                 <w:p>
                                   <w:pPr>
@@ -2964,6 +3069,7 @@
                                   <w:r>
                                     <w:rPr>
                                       <w:rFonts w:ascii="Calibri" w:hAnsi="Calibri" w:cs="Calibri"/>
+                                      <w:b/>
                                       <w:sz w:val="18"/>
                                       <w:szCs w:val="18"/>
                                     </w:rPr>
@@ -2972,6 +3078,7 @@
                                   <w:r>
                                     <w:rPr>
                                       <w:rFonts w:ascii="Calibri" w:hAnsi="Calibri" w:cs="Calibri"/>
+                                      <w:b/>
                                       <w:sz w:val="18"/>
                                       <w:szCs w:val="18"/>
                                     </w:rPr>
@@ -2980,6 +3087,7 @@
                                   <w:r>
                                     <w:rPr>
                                       <w:rFonts w:ascii="Calibri" w:hAnsi="Calibri" w:cs="Calibri"/>
+                                      <w:b/>
                                       <w:sz w:val="18"/>
                                       <w:szCs w:val="18"/>
                                     </w:rPr>
@@ -2988,6 +3096,7 @@
                                   <w:r>
                                     <w:rPr>
                                       <w:rFonts w:ascii="Calibri" w:hAnsi="Calibri" w:cs="Calibri"/>
+                                      <w:b/>
                                       <w:noProof/>
                                       <w:sz w:val="18"/>
                                       <w:szCs w:val="18"/>
@@ -2997,6 +3106,7 @@
                                   <w:r>
                                     <w:rPr>
                                       <w:rFonts w:ascii="Calibri" w:hAnsi="Calibri" w:cs="Calibri"/>
+                                      <w:b/>
                                       <w:sz w:val="18"/>
                                       <w:szCs w:val="18"/>
                                     </w:rPr>
@@ -3006,8 +3116,9 @@
                               </w:tc>
                               <w:tc>
                                 <w:tcPr>
-                                  <w:tcW w:w="1038" w:type="dxa"/>
+                                  <w:tcW w:w="1321" w:type="dxa"/>
                                   <w:tcBorders>
+                                    <w:bottom w:val="single" w:sz="4" w:space="0" w:color="auto"/>
                                     <w:right w:val="single" w:sz="4" w:space="0" w:color="auto"/>
                                   </w:tcBorders>
                                 </w:tcPr>
@@ -3027,6 +3138,7 @@
                                   <w:r>
                                     <w:rPr>
                                       <w:rFonts w:ascii="Calibri" w:hAnsi="Calibri" w:cs="Calibri"/>
+                                      <w:b/>
                                       <w:sz w:val="18"/>
                                       <w:szCs w:val="18"/>
                                     </w:rPr>
@@ -3035,6 +3147,7 @@
                                   <w:r>
                                     <w:rPr>
                                       <w:rFonts w:ascii="Calibri" w:hAnsi="Calibri" w:cs="Calibri"/>
+                                      <w:b/>
                                       <w:sz w:val="18"/>
                                       <w:szCs w:val="18"/>
                                     </w:rPr>
@@ -3043,6 +3156,7 @@
                                   <w:r>
                                     <w:rPr>
                                       <w:rFonts w:ascii="Calibri" w:hAnsi="Calibri" w:cs="Calibri"/>
+                                      <w:b/>
                                       <w:sz w:val="18"/>
                                       <w:szCs w:val="18"/>
                                     </w:rPr>
@@ -3051,6 +3165,7 @@
                                   <w:r>
                                     <w:rPr>
                                       <w:rFonts w:ascii="Calibri" w:hAnsi="Calibri" w:cs="Calibri"/>
+                                      <w:b/>
                                       <w:noProof/>
                                       <w:sz w:val="18"/>
                                       <w:szCs w:val="18"/>
@@ -3060,6 +3175,7 @@
                                   <w:r>
                                     <w:rPr>
                                       <w:rFonts w:ascii="Calibri" w:hAnsi="Calibri" w:cs="Calibri"/>
+                                      <w:b/>
                                       <w:sz w:val="18"/>
                                       <w:szCs w:val="18"/>
                                     </w:rPr>
@@ -3085,7 +3201,7 @@
                                       <w:sz w:val="2"/>
                                       <w:szCs w:val="2"/>
                                     </w:rPr>
-                                    <w:instrText xml:space="preserve"> MERGEFIELD  TableEnd:placas2 \* Lower  \* MERGEFORMAT </w:instrText>
+                                    <w:instrText xml:space="preserve"> MERGEFIELD  TableEnd:placas1 \* Lower  \* MERGEFORMAT </w:instrText>
                                   </w:r>
                                   <w:r>
                                     <w:rPr>
@@ -3106,7 +3222,7 @@
                                       <w:sz w:val="2"/>
                                       <w:szCs w:val="2"/>
                                     </w:rPr>
-                                    <w:t>«tableend:placas2»</w:t>
+                                    <w:t>«tableend:placas1»</w:t>
                                   </w:r>
                                   <w:r>
                                     <w:rPr>
@@ -3122,108 +3238,210 @@
                                 </w:p>
                               </w:tc>
                             </w:tr>
-                          </w:tbl>
-                          <w:p>
-                            <w:pPr>
-                              <w:spacing w:before="0" w:after="0"/>
-                              <w:rPr>
-                                <w:rFonts w:ascii="Calibri" w:hAnsi="Calibri" w:cs="Calibri"/>
-                                <w:b/>
-                                <w:caps/>
-                                <w:noProof/>
-                                <w:sz w:val="2"/>
-                                <w:szCs w:val="2"/>
-                              </w:rPr>
-                            </w:pPr>
-                          </w:p>
-                          <w:tbl>
-                            <w:tblPr>
-                              <w:tblStyle w:val="Tablaconcuadrcula"/>
-                              <w:tblW w:w="0" w:type="auto"/>
-                              <w:tblBorders>
-                                <w:top w:val="none" w:sz="0" w:space="0" w:color="auto"/>
-                                <w:left w:val="none" w:sz="0" w:space="0" w:color="auto"/>
-                                <w:bottom w:val="none" w:sz="0" w:space="0" w:color="auto"/>
-                                <w:right w:val="none" w:sz="0" w:space="0" w:color="auto"/>
-                                <w:insideH w:val="none" w:sz="0" w:space="0" w:color="auto"/>
-                                <w:insideV w:val="none" w:sz="0" w:space="0" w:color="auto"/>
-                              </w:tblBorders>
-                              <w:tblLook w:val="04A0" w:firstRow="1" w:lastRow="0" w:firstColumn="1" w:lastColumn="0" w:noHBand="0" w:noVBand="1"/>
-                            </w:tblPr>
-                            <w:tblGrid>
-                              <w:gridCol w:w="2081"/>
-                              <w:gridCol w:w="2213"/>
-                            </w:tblGrid>
+                            <w:tr>
+                              <w:trPr>
+                                <w:trHeight w:val="79"/>
+                              </w:trPr>
+                              <w:tc>
+                                <w:tcPr>
+                                  <w:tcW w:w="942" w:type="dxa"/>
+                                  <w:tcBorders>
+                                    <w:top w:val="single" w:sz="4" w:space="0" w:color="auto"/>
+                                    <w:left w:val="nil"/>
+                                    <w:bottom w:val="single" w:sz="4" w:space="0" w:color="auto"/>
+                                    <w:right w:val="nil"/>
+                                  </w:tcBorders>
+                                </w:tcPr>
+                                <w:p>
+                                  <w:pPr>
+                                    <w:rPr>
+                                      <w:sz w:val="4"/>
+                                      <w:szCs w:val="4"/>
+                                    </w:rPr>
+                                  </w:pPr>
+                                </w:p>
+                              </w:tc>
+                              <w:tc>
+                                <w:tcPr>
+                                  <w:tcW w:w="1321" w:type="dxa"/>
+                                  <w:tcBorders>
+                                    <w:top w:val="single" w:sz="4" w:space="0" w:color="auto"/>
+                                    <w:left w:val="nil"/>
+                                    <w:bottom w:val="single" w:sz="4" w:space="0" w:color="auto"/>
+                                    <w:right w:val="nil"/>
+                                  </w:tcBorders>
+                                </w:tcPr>
+                                <w:p>
+                                  <w:pPr>
+                                    <w:rPr>
+                                      <w:sz w:val="4"/>
+                                      <w:szCs w:val="4"/>
+                                    </w:rPr>
+                                  </w:pPr>
+                                </w:p>
+                              </w:tc>
+                              <w:tc>
+                                <w:tcPr>
+                                  <w:tcW w:w="1231" w:type="dxa"/>
+                                  <w:tcBorders>
+                                    <w:top w:val="single" w:sz="4" w:space="0" w:color="auto"/>
+                                    <w:left w:val="nil"/>
+                                    <w:bottom w:val="nil"/>
+                                    <w:right w:val="nil"/>
+                                  </w:tcBorders>
+                                </w:tcPr>
+                                <w:p>
+                                  <w:pPr>
+                                    <w:rPr>
+                                      <w:sz w:val="4"/>
+                                      <w:szCs w:val="4"/>
+                                    </w:rPr>
+                                  </w:pPr>
+                                </w:p>
+                              </w:tc>
+                              <w:tc>
+                                <w:tcPr>
+                                  <w:tcW w:w="1321" w:type="dxa"/>
+                                  <w:tcBorders>
+                                    <w:top w:val="single" w:sz="4" w:space="0" w:color="auto"/>
+                                    <w:left w:val="nil"/>
+                                    <w:bottom w:val="nil"/>
+                                    <w:right w:val="nil"/>
+                                  </w:tcBorders>
+                                </w:tcPr>
+                                <w:p>
+                                  <w:pPr>
+                                    <w:rPr>
+                                      <w:sz w:val="4"/>
+                                      <w:szCs w:val="4"/>
+                                    </w:rPr>
+                                  </w:pPr>
+                                </w:p>
+                              </w:tc>
+                              <w:tc>
+                                <w:tcPr>
+                                  <w:tcW w:w="387" w:type="dxa"/>
+                                  <w:tcBorders>
+                                    <w:top w:val="nil"/>
+                                    <w:left w:val="nil"/>
+                                    <w:bottom w:val="nil"/>
+                                    <w:right w:val="nil"/>
+                                  </w:tcBorders>
+                                </w:tcPr>
+                                <w:p>
+                                  <w:pPr>
+                                    <w:rPr>
+                                      <w:sz w:val="4"/>
+                                      <w:szCs w:val="4"/>
+                                    </w:rPr>
+                                  </w:pPr>
+                                </w:p>
+                              </w:tc>
+                              <w:tc>
+                                <w:tcPr>
+                                  <w:tcW w:w="1172" w:type="dxa"/>
+                                  <w:tcBorders>
+                                    <w:top w:val="nil"/>
+                                    <w:left w:val="nil"/>
+                                    <w:bottom w:val="nil"/>
+                                    <w:right w:val="nil"/>
+                                  </w:tcBorders>
+                                </w:tcPr>
+                                <w:p>
+                                  <w:pPr>
+                                    <w:rPr>
+                                      <w:sz w:val="4"/>
+                                      <w:szCs w:val="4"/>
+                                    </w:rPr>
+                                  </w:pPr>
+                                </w:p>
+                              </w:tc>
+                            </w:tr>
                             <w:tr>
                               <w:tc>
                                 <w:tcPr>
-                                  <w:tcW w:w="2081" w:type="dxa"/>
+                                  <w:tcW w:w="2263" w:type="dxa"/>
+                                  <w:gridSpan w:val="2"/>
                                   <w:tcBorders>
                                     <w:top w:val="single" w:sz="4" w:space="0" w:color="auto"/>
+                                    <w:left w:val="nil"/>
+                                    <w:bottom w:val="nil"/>
+                                    <w:right w:val="nil"/>
                                   </w:tcBorders>
                                 </w:tcPr>
                                 <w:p>
                                   <w:pPr>
                                     <w:spacing w:before="0" w:after="0"/>
+                                    <w:jc w:val="center"/>
+                                    <w:rPr>
+                                      <w:rFonts w:ascii="Calibri" w:hAnsi="Calibri" w:cs="Calibri"/>
+                                      <w:b/>
+                                      <w:sz w:val="18"/>
+                                      <w:szCs w:val="18"/>
+                                    </w:rPr>
+                                  </w:pPr>
+                                  <w:r>
                                     <w:rPr>
                                       <w:rFonts w:ascii="Calibri" w:hAnsi="Calibri" w:cs="Calibri"/>
                                       <w:b/>
                                       <w:caps/>
                                       <w:noProof/>
-                                      <w:sz w:val="18"/>
-                                      <w:szCs w:val="18"/>
-                                    </w:rPr>
-                                  </w:pPr>
-                                  <w:r>
-                                    <w:rPr>
-                                      <w:rFonts w:ascii="Calibri" w:hAnsi="Calibri" w:cs="Calibri"/>
-                                      <w:b/>
-                                      <w:caps/>
-                                      <w:noProof/>
-                                      <w:sz w:val="18"/>
-                                      <w:szCs w:val="18"/>
-                                    </w:rPr>
-                                    <w:t>SUB-TOTAL  – 2</w:t>
+                                      <w:sz w:val="22"/>
+                                      <w:szCs w:val="22"/>
+                                    </w:rPr>
+                                    <w:t>SUB-TOTAL  – 1</w:t>
                                   </w:r>
                                 </w:p>
                               </w:tc>
                               <w:tc>
                                 <w:tcPr>
-                                  <w:tcW w:w="2213" w:type="dxa"/>
+                                  <w:tcW w:w="2552" w:type="dxa"/>
+                                  <w:gridSpan w:val="2"/>
+                                  <w:tcBorders>
+                                    <w:top w:val="nil"/>
+                                    <w:left w:val="nil"/>
+                                    <w:bottom w:val="nil"/>
+                                    <w:right w:val="nil"/>
+                                  </w:tcBorders>
                                 </w:tcPr>
                                 <w:p>
                                   <w:pPr>
                                     <w:spacing w:before="0" w:after="0"/>
-                                    <w:ind w:right="33"/>
+                                    <w:jc w:val="center"/>
+                                    <w:rPr>
+                                      <w:rFonts w:ascii="Calibri" w:hAnsi="Calibri" w:cs="Calibri"/>
+                                      <w:b/>
+                                      <w:sz w:val="18"/>
+                                      <w:szCs w:val="18"/>
+                                    </w:rPr>
+                                  </w:pPr>
+                                  <w:r>
                                     <w:rPr>
                                       <w:rFonts w:ascii="Calibri" w:hAnsi="Calibri" w:cs="Calibri"/>
                                       <w:b/>
                                       <w:bCs/>
-                                      <w:caps/>
-                                      <w:noProof/>
-                                    </w:rPr>
-                                  </w:pPr>
+                                      <w:sz w:val="22"/>
+                                      <w:szCs w:val="22"/>
+                                    </w:rPr>
+                                    <w:fldChar w:fldCharType="begin"/>
+                                  </w:r>
                                   <w:r>
                                     <w:rPr>
                                       <w:rFonts w:ascii="Calibri" w:hAnsi="Calibri" w:cs="Calibri"/>
                                       <w:b/>
                                       <w:bCs/>
-                                    </w:rPr>
-                                    <w:fldChar w:fldCharType="begin"/>
+                                      <w:sz w:val="22"/>
+                                      <w:szCs w:val="22"/>
+                                    </w:rPr>
+                                    <w:instrText xml:space="preserve"> MERGEFIELD  total_neto_placa1  \* MERGEFORMAT </w:instrText>
                                   </w:r>
                                   <w:r>
                                     <w:rPr>
                                       <w:rFonts w:ascii="Calibri" w:hAnsi="Calibri" w:cs="Calibri"/>
                                       <w:b/>
                                       <w:bCs/>
-                                    </w:rPr>
-                                    <w:instrText xml:space="preserve"> MERGEFIELD  total_neto_placa2  \* MERGEFORMAT </w:instrText>
-                                  </w:r>
-                                  <w:r>
-                                    <w:rPr>
-                                      <w:rFonts w:ascii="Calibri" w:hAnsi="Calibri" w:cs="Calibri"/>
-                                      <w:b/>
-                                      <w:bCs/>
+                                      <w:sz w:val="22"/>
+                                      <w:szCs w:val="22"/>
                                     </w:rPr>
                                     <w:fldChar w:fldCharType="separate"/>
                                   </w:r>
@@ -3233,26 +3451,74 @@
                                       <w:b/>
                                       <w:bCs/>
                                       <w:noProof/>
-                                    </w:rPr>
-                                    <w:t>«total_neto_placa2»</w:t>
+                                      <w:sz w:val="22"/>
+                                      <w:szCs w:val="22"/>
+                                    </w:rPr>
+                                    <w:t>«total_neto_placa1»</w:t>
                                   </w:r>
                                   <w:r>
                                     <w:rPr>
                                       <w:rFonts w:ascii="Calibri" w:hAnsi="Calibri" w:cs="Calibri"/>
                                       <w:b/>
                                       <w:bCs/>
+                                      <w:sz w:val="22"/>
+                                      <w:szCs w:val="22"/>
                                     </w:rPr>
                                     <w:fldChar w:fldCharType="end"/>
                                   </w:r>
                                 </w:p>
                               </w:tc>
+                              <w:tc>
+                                <w:tcPr>
+                                  <w:tcW w:w="387" w:type="dxa"/>
+                                  <w:tcBorders>
+                                    <w:top w:val="nil"/>
+                                    <w:left w:val="nil"/>
+                                    <w:bottom w:val="nil"/>
+                                    <w:right w:val="nil"/>
+                                  </w:tcBorders>
+                                </w:tcPr>
+                                <w:p>
+                                  <w:pPr>
+                                    <w:spacing w:before="0" w:after="0"/>
+                                    <w:jc w:val="center"/>
+                                    <w:rPr>
+                                      <w:rFonts w:ascii="Calibri" w:hAnsi="Calibri" w:cs="Calibri"/>
+                                      <w:b/>
+                                      <w:bCs/>
+                                      <w:sz w:val="22"/>
+                                      <w:szCs w:val="22"/>
+                                    </w:rPr>
+                                  </w:pPr>
+                                </w:p>
+                              </w:tc>
+                              <w:tc>
+                                <w:tcPr>
+                                  <w:tcW w:w="1172" w:type="dxa"/>
+                                  <w:tcBorders>
+                                    <w:top w:val="nil"/>
+                                    <w:left w:val="nil"/>
+                                    <w:bottom w:val="nil"/>
+                                    <w:right w:val="nil"/>
+                                  </w:tcBorders>
+                                </w:tcPr>
+                                <w:p>
+                                  <w:pPr>
+                                    <w:spacing w:before="0" w:after="0"/>
+                                    <w:jc w:val="center"/>
+                                    <w:rPr>
+                                      <w:rFonts w:ascii="Calibri" w:hAnsi="Calibri" w:cs="Calibri"/>
+                                      <w:b/>
+                                      <w:bCs/>
+                                      <w:sz w:val="22"/>
+                                      <w:szCs w:val="22"/>
+                                    </w:rPr>
+                                  </w:pPr>
+                                </w:p>
+                              </w:tc>
                             </w:tr>
                           </w:tbl>
-                          <w:p>
-                            <w:pPr>
-                              <w:jc w:val="center"/>
-                            </w:pPr>
-                          </w:p>
+                          <w:p/>
                         </w:txbxContent>
                       </wps:txbx>
                       <wps:bodyPr rot="0" spcFirstLastPara="0" vertOverflow="overflow" horzOverflow="overflow" vert="horz" wrap="square" lIns="91440" tIns="45720" rIns="91440" bIns="45720" numCol="1" spcCol="0" rtlCol="0" fromWordArt="0" anchor="ctr" anchorCtr="0" forceAA="0" compatLnSpc="1">
@@ -3269,25 +3535,32 @@
           </mc:Choice>
           <mc:Fallback>
             <w:pict>
-              <v:rect w14:anchorId="2CDD55FC" id="Rectángulo 2" o:spid="_x0000_s1027" style="position:absolute;left:0;text-align:left;margin-left:335.3pt;margin-top:.55pt;width:231.1pt;height:87.4pt;z-index:251662336;visibility:visible;mso-wrap-style:square;mso-wrap-distance-left:9pt;mso-wrap-distance-top:0;mso-wrap-distance-right:9pt;mso-wrap-distance-bottom:0;mso-position-horizontal:absolute;mso-position-horizontal-relative:text;mso-position-vertical:absolute;mso-position-vertical-relative:text;v-text-anchor:middle" o:gfxdata="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" filled="f" stroked="f">
+              <v:rect w14:anchorId="5990CF46" id="Rectángulo 2" o:spid="_x0000_s1027" style="position:absolute;left:0;text-align:left;margin-left:7.3pt;margin-top:.15pt;width:307.5pt;height:80pt;z-index:251683840;visibility:visible;mso-wrap-style:square;mso-wrap-distance-left:9pt;mso-wrap-distance-top:0;mso-wrap-distance-right:9pt;mso-wrap-distance-bottom:0;mso-position-horizontal:absolute;mso-position-horizontal-relative:text;mso-position-vertical:absolute;mso-position-vertical-relative:text;v-text-anchor:middle" o:gfxdata="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" filled="f" stroked="f">
                 <v:textbox>
                   <w:txbxContent>
                     <w:tbl>
                       <w:tblPr>
                         <w:tblStyle w:val="Tablaconcuadrcula"/>
-                        <w:tblW w:w="0" w:type="auto"/>
+                        <w:tblW w:w="6374" w:type="dxa"/>
+                        <w:tblLayout w:type="fixed"/>
                         <w:tblLook w:val="04A0" w:firstRow="1" w:lastRow="0" w:firstColumn="1" w:lastColumn="0" w:noHBand="0" w:noVBand="1"/>
                       </w:tblPr>
                       <w:tblGrid>
-                        <w:gridCol w:w="988"/>
-                        <w:gridCol w:w="1097"/>
-                        <w:gridCol w:w="1171"/>
-                        <w:gridCol w:w="1067"/>
+                        <w:gridCol w:w="942"/>
+                        <w:gridCol w:w="1321"/>
+                        <w:gridCol w:w="1231"/>
+                        <w:gridCol w:w="1321"/>
+                        <w:gridCol w:w="387"/>
+                        <w:gridCol w:w="1172"/>
                       </w:tblGrid>
                       <w:tr>
+                        <w:trPr>
+                          <w:gridAfter w:val="2"/>
+                          <w:wAfter w:w="1559" w:type="dxa"/>
+                        </w:trPr>
                         <w:tc>
                           <w:tcPr>
-                            <w:tcW w:w="4294" w:type="dxa"/>
+                            <w:tcW w:w="4815" w:type="dxa"/>
                             <w:gridSpan w:val="4"/>
                             <w:tcBorders>
                               <w:right w:val="single" w:sz="4" w:space="0" w:color="auto"/>
@@ -3300,6 +3573,7 @@
                               <w:rPr>
                                 <w:rFonts w:ascii="Calibri" w:hAnsi="Calibri" w:cs="Calibri"/>
                                 <w:b/>
+                                <w:bCs/>
                                 <w:caps/>
                                 <w:noProof/>
                                 <w:sz w:val="18"/>
@@ -3308,6 +3582,8 @@
                             </w:pPr>
                             <w:r>
                               <w:rPr>
+                                <w:b/>
+                                <w:bCs/>
                                 <w:sz w:val="18"/>
                                 <w:szCs w:val="18"/>
                               </w:rPr>
@@ -3315,13 +3591,17 @@
                             </w:r>
                             <w:r>
                               <w:rPr>
+                                <w:b/>
+                                <w:bCs/>
                                 <w:sz w:val="18"/>
                                 <w:szCs w:val="18"/>
                               </w:rPr>
-                              <w:instrText xml:space="preserve"> MERGEFIELD  placa2  \* MERGEFORMAT </w:instrText>
+                              <w:instrText xml:space="preserve"> MERGEFIELD  placa1  \* MERGEFORMAT </w:instrText>
                             </w:r>
                             <w:r>
                               <w:rPr>
+                                <w:b/>
+                                <w:bCs/>
                                 <w:sz w:val="18"/>
                                 <w:szCs w:val="18"/>
                               </w:rPr>
@@ -3329,14 +3609,18 @@
                             </w:r>
                             <w:r>
                               <w:rPr>
+                                <w:b/>
+                                <w:bCs/>
                                 <w:noProof/>
                                 <w:sz w:val="18"/>
                                 <w:szCs w:val="18"/>
                               </w:rPr>
-                              <w:t>«placa2»</w:t>
+                              <w:t>«placa1»</w:t>
                             </w:r>
                             <w:r>
                               <w:rPr>
+                                <w:b/>
+                                <w:bCs/>
                                 <w:sz w:val="18"/>
                                 <w:szCs w:val="18"/>
                               </w:rPr>
@@ -3346,9 +3630,16 @@
                         </w:tc>
                       </w:tr>
                       <w:tr>
+                        <w:trPr>
+                          <w:gridAfter w:val="2"/>
+                          <w:wAfter w:w="1559" w:type="dxa"/>
+                        </w:trPr>
                         <w:tc>
                           <w:tcPr>
-                            <w:tcW w:w="988" w:type="dxa"/>
+                            <w:tcW w:w="942" w:type="dxa"/>
+                            <w:tcBorders>
+                              <w:bottom w:val="single" w:sz="4" w:space="0" w:color="auto"/>
+                            </w:tcBorders>
                           </w:tcPr>
                           <w:p>
                             <w:pPr>
@@ -3378,7 +3669,10 @@
                         </w:tc>
                         <w:tc>
                           <w:tcPr>
-                            <w:tcW w:w="1097" w:type="dxa"/>
+                            <w:tcW w:w="1321" w:type="dxa"/>
+                            <w:tcBorders>
+                              <w:bottom w:val="single" w:sz="4" w:space="0" w:color="auto"/>
+                            </w:tcBorders>
                           </w:tcPr>
                           <w:p>
                             <w:pPr>
@@ -3408,7 +3702,10 @@
                         </w:tc>
                         <w:tc>
                           <w:tcPr>
-                            <w:tcW w:w="1171" w:type="dxa"/>
+                            <w:tcW w:w="1231" w:type="dxa"/>
+                            <w:tcBorders>
+                              <w:bottom w:val="single" w:sz="4" w:space="0" w:color="auto"/>
+                            </w:tcBorders>
                           </w:tcPr>
                           <w:p>
                             <w:pPr>
@@ -3438,8 +3735,9 @@
                         </w:tc>
                         <w:tc>
                           <w:tcPr>
-                            <w:tcW w:w="1038" w:type="dxa"/>
+                            <w:tcW w:w="1321" w:type="dxa"/>
                             <w:tcBorders>
+                              <w:bottom w:val="single" w:sz="4" w:space="0" w:color="auto"/>
                               <w:right w:val="single" w:sz="4" w:space="0" w:color="auto"/>
                             </w:tcBorders>
                           </w:tcPr>
@@ -3471,9 +3769,16 @@
                         </w:tc>
                       </w:tr>
                       <w:tr>
+                        <w:trPr>
+                          <w:gridAfter w:val="2"/>
+                          <w:wAfter w:w="1559" w:type="dxa"/>
+                        </w:trPr>
                         <w:tc>
                           <w:tcPr>
-                            <w:tcW w:w="988" w:type="dxa"/>
+                            <w:tcW w:w="942" w:type="dxa"/>
+                            <w:tcBorders>
+                              <w:bottom w:val="single" w:sz="4" w:space="0" w:color="auto"/>
+                            </w:tcBorders>
                           </w:tcPr>
                           <w:p>
                             <w:pPr>
@@ -3508,7 +3813,7 @@
                                 <w:sz w:val="2"/>
                                 <w:szCs w:val="2"/>
                               </w:rPr>
-                              <w:instrText xml:space="preserve"> MERGEFIELD  TableStart:placas2 \* Lower  \* MERGEFORMAT </w:instrText>
+                              <w:instrText xml:space="preserve"> MERGEFIELD  TableStart:placas1 \* Lower  \* MERGEFORMAT </w:instrText>
                             </w:r>
                             <w:r>
                               <w:rPr>
@@ -3529,7 +3834,7 @@
                                 <w:sz w:val="2"/>
                                 <w:szCs w:val="2"/>
                               </w:rPr>
-                              <w:t>«tablestart:placas2»</w:t>
+                              <w:t>«tablestart:placas1»</w:t>
                             </w:r>
                             <w:r>
                               <w:rPr>
@@ -3545,6 +3850,7 @@
                             <w:r>
                               <w:rPr>
                                 <w:rFonts w:ascii="Calibri" w:hAnsi="Calibri" w:cs="Calibri"/>
+                                <w:b/>
                                 <w:sz w:val="18"/>
                                 <w:szCs w:val="18"/>
                               </w:rPr>
@@ -3553,6 +3859,7 @@
                             <w:r>
                               <w:rPr>
                                 <w:rFonts w:ascii="Calibri" w:hAnsi="Calibri" w:cs="Calibri"/>
+                                <w:b/>
                                 <w:sz w:val="18"/>
                                 <w:szCs w:val="18"/>
                               </w:rPr>
@@ -3561,6 +3868,7 @@
                             <w:r>
                               <w:rPr>
                                 <w:rFonts w:ascii="Calibri" w:hAnsi="Calibri" w:cs="Calibri"/>
+                                <w:b/>
                                 <w:sz w:val="18"/>
                                 <w:szCs w:val="18"/>
                               </w:rPr>
@@ -3569,6 +3877,7 @@
                             <w:r>
                               <w:rPr>
                                 <w:rFonts w:ascii="Calibri" w:hAnsi="Calibri" w:cs="Calibri"/>
+                                <w:b/>
                                 <w:noProof/>
                                 <w:sz w:val="18"/>
                                 <w:szCs w:val="18"/>
@@ -3578,6 +3887,7 @@
                             <w:r>
                               <w:rPr>
                                 <w:rFonts w:ascii="Calibri" w:hAnsi="Calibri" w:cs="Calibri"/>
+                                <w:b/>
                                 <w:sz w:val="18"/>
                                 <w:szCs w:val="18"/>
                               </w:rPr>
@@ -3587,7 +3897,10 @@
                         </w:tc>
                         <w:tc>
                           <w:tcPr>
-                            <w:tcW w:w="1097" w:type="dxa"/>
+                            <w:tcW w:w="1321" w:type="dxa"/>
+                            <w:tcBorders>
+                              <w:bottom w:val="single" w:sz="4" w:space="0" w:color="auto"/>
+                            </w:tcBorders>
                           </w:tcPr>
                           <w:p>
                             <w:pPr>
@@ -3605,6 +3918,7 @@
                             <w:r>
                               <w:rPr>
                                 <w:rFonts w:ascii="Calibri" w:hAnsi="Calibri" w:cs="Calibri"/>
+                                <w:b/>
                                 <w:sz w:val="18"/>
                                 <w:szCs w:val="18"/>
                               </w:rPr>
@@ -3613,6 +3927,7 @@
                             <w:r>
                               <w:rPr>
                                 <w:rFonts w:ascii="Calibri" w:hAnsi="Calibri" w:cs="Calibri"/>
+                                <w:b/>
                                 <w:sz w:val="18"/>
                                 <w:szCs w:val="18"/>
                               </w:rPr>
@@ -3621,6 +3936,7 @@
                             <w:r>
                               <w:rPr>
                                 <w:rFonts w:ascii="Calibri" w:hAnsi="Calibri" w:cs="Calibri"/>
+                                <w:b/>
                                 <w:sz w:val="18"/>
                                 <w:szCs w:val="18"/>
                               </w:rPr>
@@ -3629,6 +3945,7 @@
                             <w:r>
                               <w:rPr>
                                 <w:rFonts w:ascii="Calibri" w:hAnsi="Calibri" w:cs="Calibri"/>
+                                <w:b/>
                                 <w:noProof/>
                                 <w:sz w:val="18"/>
                                 <w:szCs w:val="18"/>
@@ -3638,6 +3955,7 @@
                             <w:r>
                               <w:rPr>
                                 <w:rFonts w:ascii="Calibri" w:hAnsi="Calibri" w:cs="Calibri"/>
+                                <w:b/>
                                 <w:sz w:val="18"/>
                                 <w:szCs w:val="18"/>
                               </w:rPr>
@@ -3647,7 +3965,10 @@
                         </w:tc>
                         <w:tc>
                           <w:tcPr>
-                            <w:tcW w:w="1171" w:type="dxa"/>
+                            <w:tcW w:w="1231" w:type="dxa"/>
+                            <w:tcBorders>
+                              <w:bottom w:val="single" w:sz="4" w:space="0" w:color="auto"/>
+                            </w:tcBorders>
                           </w:tcPr>
                           <w:p>
                             <w:pPr>
@@ -3665,6 +3986,7 @@
                             <w:r>
                               <w:rPr>
                                 <w:rFonts w:ascii="Calibri" w:hAnsi="Calibri" w:cs="Calibri"/>
+                                <w:b/>
                                 <w:sz w:val="18"/>
                                 <w:szCs w:val="18"/>
                               </w:rPr>
@@ -3673,6 +3995,7 @@
                             <w:r>
                               <w:rPr>
                                 <w:rFonts w:ascii="Calibri" w:hAnsi="Calibri" w:cs="Calibri"/>
+                                <w:b/>
                                 <w:sz w:val="18"/>
                                 <w:szCs w:val="18"/>
                               </w:rPr>
@@ -3681,6 +4004,7 @@
                             <w:r>
                               <w:rPr>
                                 <w:rFonts w:ascii="Calibri" w:hAnsi="Calibri" w:cs="Calibri"/>
+                                <w:b/>
                                 <w:sz w:val="18"/>
                                 <w:szCs w:val="18"/>
                               </w:rPr>
@@ -3689,6 +4013,7 @@
                             <w:r>
                               <w:rPr>
                                 <w:rFonts w:ascii="Calibri" w:hAnsi="Calibri" w:cs="Calibri"/>
+                                <w:b/>
                                 <w:noProof/>
                                 <w:sz w:val="18"/>
                                 <w:szCs w:val="18"/>
@@ -3698,6 +4023,7 @@
                             <w:r>
                               <w:rPr>
                                 <w:rFonts w:ascii="Calibri" w:hAnsi="Calibri" w:cs="Calibri"/>
+                                <w:b/>
                                 <w:sz w:val="18"/>
                                 <w:szCs w:val="18"/>
                               </w:rPr>
@@ -3707,8 +4033,9 @@
                         </w:tc>
                         <w:tc>
                           <w:tcPr>
-                            <w:tcW w:w="1038" w:type="dxa"/>
+                            <w:tcW w:w="1321" w:type="dxa"/>
                             <w:tcBorders>
+                              <w:bottom w:val="single" w:sz="4" w:space="0" w:color="auto"/>
                               <w:right w:val="single" w:sz="4" w:space="0" w:color="auto"/>
                             </w:tcBorders>
                           </w:tcPr>
@@ -3728,6 +4055,7 @@
                             <w:r>
                               <w:rPr>
                                 <w:rFonts w:ascii="Calibri" w:hAnsi="Calibri" w:cs="Calibri"/>
+                                <w:b/>
                                 <w:sz w:val="18"/>
                                 <w:szCs w:val="18"/>
                               </w:rPr>
@@ -3736,6 +4064,7 @@
                             <w:r>
                               <w:rPr>
                                 <w:rFonts w:ascii="Calibri" w:hAnsi="Calibri" w:cs="Calibri"/>
+                                <w:b/>
                                 <w:sz w:val="18"/>
                                 <w:szCs w:val="18"/>
                               </w:rPr>
@@ -3744,6 +4073,7 @@
                             <w:r>
                               <w:rPr>
                                 <w:rFonts w:ascii="Calibri" w:hAnsi="Calibri" w:cs="Calibri"/>
+                                <w:b/>
                                 <w:sz w:val="18"/>
                                 <w:szCs w:val="18"/>
                               </w:rPr>
@@ -3752,6 +4082,7 @@
                             <w:r>
                               <w:rPr>
                                 <w:rFonts w:ascii="Calibri" w:hAnsi="Calibri" w:cs="Calibri"/>
+                                <w:b/>
                                 <w:noProof/>
                                 <w:sz w:val="18"/>
                                 <w:szCs w:val="18"/>
@@ -3761,6 +4092,7 @@
                             <w:r>
                               <w:rPr>
                                 <w:rFonts w:ascii="Calibri" w:hAnsi="Calibri" w:cs="Calibri"/>
+                                <w:b/>
                                 <w:sz w:val="18"/>
                                 <w:szCs w:val="18"/>
                               </w:rPr>
@@ -3786,7 +4118,7 @@
                                 <w:sz w:val="2"/>
                                 <w:szCs w:val="2"/>
                               </w:rPr>
-                              <w:instrText xml:space="preserve"> MERGEFIELD  TableEnd:placas2 \* Lower  \* MERGEFORMAT </w:instrText>
+                              <w:instrText xml:space="preserve"> MERGEFIELD  TableEnd:placas1 \* Lower  \* MERGEFORMAT </w:instrText>
                             </w:r>
                             <w:r>
                               <w:rPr>
@@ -3807,7 +4139,7 @@
                                 <w:sz w:val="2"/>
                                 <w:szCs w:val="2"/>
                               </w:rPr>
-                              <w:t>«tableend:placas2»</w:t>
+                              <w:t>«tableend:placas1»</w:t>
                             </w:r>
                             <w:r>
                               <w:rPr>
@@ -3823,964 +4155,135 @@
                           </w:p>
                         </w:tc>
                       </w:tr>
-                    </w:tbl>
-                    <w:p>
-                      <w:pPr>
-                        <w:spacing w:before="0" w:after="0"/>
-                        <w:rPr>
-                          <w:rFonts w:ascii="Calibri" w:hAnsi="Calibri" w:cs="Calibri"/>
-                          <w:b/>
-                          <w:caps/>
-                          <w:noProof/>
-                          <w:sz w:val="2"/>
-                          <w:szCs w:val="2"/>
-                        </w:rPr>
-                      </w:pPr>
-                    </w:p>
-                    <w:tbl>
-                      <w:tblPr>
-                        <w:tblStyle w:val="Tablaconcuadrcula"/>
-                        <w:tblW w:w="0" w:type="auto"/>
-                        <w:tblBorders>
-                          <w:top w:val="none" w:sz="0" w:space="0" w:color="auto"/>
-                          <w:left w:val="none" w:sz="0" w:space="0" w:color="auto"/>
-                          <w:bottom w:val="none" w:sz="0" w:space="0" w:color="auto"/>
-                          <w:right w:val="none" w:sz="0" w:space="0" w:color="auto"/>
-                          <w:insideH w:val="none" w:sz="0" w:space="0" w:color="auto"/>
-                          <w:insideV w:val="none" w:sz="0" w:space="0" w:color="auto"/>
-                        </w:tblBorders>
-                        <w:tblLook w:val="04A0" w:firstRow="1" w:lastRow="0" w:firstColumn="1" w:lastColumn="0" w:noHBand="0" w:noVBand="1"/>
-                      </w:tblPr>
-                      <w:tblGrid>
-                        <w:gridCol w:w="2081"/>
-                        <w:gridCol w:w="2213"/>
-                      </w:tblGrid>
                       <w:tr>
+                        <w:trPr>
+                          <w:trHeight w:val="79"/>
+                        </w:trPr>
                         <w:tc>
                           <w:tcPr>
-                            <w:tcW w:w="2081" w:type="dxa"/>
+                            <w:tcW w:w="942" w:type="dxa"/>
                             <w:tcBorders>
                               <w:top w:val="single" w:sz="4" w:space="0" w:color="auto"/>
+                              <w:left w:val="nil"/>
+                              <w:bottom w:val="single" w:sz="4" w:space="0" w:color="auto"/>
+                              <w:right w:val="nil"/>
                             </w:tcBorders>
                           </w:tcPr>
                           <w:p>
                             <w:pPr>
-                              <w:spacing w:before="0" w:after="0"/>
-                              <w:rPr>
-                                <w:rFonts w:ascii="Calibri" w:hAnsi="Calibri" w:cs="Calibri"/>
-                                <w:b/>
-                                <w:caps/>
-                                <w:noProof/>
-                                <w:sz w:val="18"/>
-                                <w:szCs w:val="18"/>
+                              <w:rPr>
+                                <w:sz w:val="4"/>
+                                <w:szCs w:val="4"/>
                               </w:rPr>
                             </w:pPr>
-                            <w:r>
-                              <w:rPr>
-                                <w:rFonts w:ascii="Calibri" w:hAnsi="Calibri" w:cs="Calibri"/>
-                                <w:b/>
-                                <w:caps/>
-                                <w:noProof/>
-                                <w:sz w:val="18"/>
-                                <w:szCs w:val="18"/>
-                              </w:rPr>
-                              <w:t>SUB-TOTAL  – 2</w:t>
-                            </w:r>
                           </w:p>
                         </w:tc>
                         <w:tc>
                           <w:tcPr>
-                            <w:tcW w:w="2213" w:type="dxa"/>
+                            <w:tcW w:w="1321" w:type="dxa"/>
+                            <w:tcBorders>
+                              <w:top w:val="single" w:sz="4" w:space="0" w:color="auto"/>
+                              <w:left w:val="nil"/>
+                              <w:bottom w:val="single" w:sz="4" w:space="0" w:color="auto"/>
+                              <w:right w:val="nil"/>
+                            </w:tcBorders>
                           </w:tcPr>
                           <w:p>
                             <w:pPr>
-                              <w:spacing w:before="0" w:after="0"/>
-                              <w:ind w:right="33"/>
-                              <w:rPr>
-                                <w:rFonts w:ascii="Calibri" w:hAnsi="Calibri" w:cs="Calibri"/>
-                                <w:b/>
-                                <w:bCs/>
-                                <w:caps/>
-                                <w:noProof/>
+                              <w:rPr>
+                                <w:sz w:val="4"/>
+                                <w:szCs w:val="4"/>
                               </w:rPr>
                             </w:pPr>
-                            <w:r>
-                              <w:rPr>
-                                <w:rFonts w:ascii="Calibri" w:hAnsi="Calibri" w:cs="Calibri"/>
-                                <w:b/>
-                                <w:bCs/>
-                              </w:rPr>
-                              <w:fldChar w:fldCharType="begin"/>
-                            </w:r>
-                            <w:r>
-                              <w:rPr>
-                                <w:rFonts w:ascii="Calibri" w:hAnsi="Calibri" w:cs="Calibri"/>
-                                <w:b/>
-                                <w:bCs/>
-                              </w:rPr>
-                              <w:instrText xml:space="preserve"> MERGEFIELD  total_neto_placa2  \* MERGEFORMAT </w:instrText>
-                            </w:r>
-                            <w:r>
-                              <w:rPr>
-                                <w:rFonts w:ascii="Calibri" w:hAnsi="Calibri" w:cs="Calibri"/>
-                                <w:b/>
-                                <w:bCs/>
-                              </w:rPr>
-                              <w:fldChar w:fldCharType="separate"/>
-                            </w:r>
-                            <w:r>
-                              <w:rPr>
-                                <w:rFonts w:ascii="Calibri" w:hAnsi="Calibri" w:cs="Calibri"/>
-                                <w:b/>
-                                <w:bCs/>
-                                <w:noProof/>
-                              </w:rPr>
-                              <w:t>«total_neto_placa2»</w:t>
-                            </w:r>
-                            <w:r>
-                              <w:rPr>
-                                <w:rFonts w:ascii="Calibri" w:hAnsi="Calibri" w:cs="Calibri"/>
-                                <w:b/>
-                                <w:bCs/>
-                              </w:rPr>
-                              <w:fldChar w:fldCharType="end"/>
-                            </w:r>
+                          </w:p>
+                        </w:tc>
+                        <w:tc>
+                          <w:tcPr>
+                            <w:tcW w:w="1231" w:type="dxa"/>
+                            <w:tcBorders>
+                              <w:top w:val="single" w:sz="4" w:space="0" w:color="auto"/>
+                              <w:left w:val="nil"/>
+                              <w:bottom w:val="nil"/>
+                              <w:right w:val="nil"/>
+                            </w:tcBorders>
+                          </w:tcPr>
+                          <w:p>
+                            <w:pPr>
+                              <w:rPr>
+                                <w:sz w:val="4"/>
+                                <w:szCs w:val="4"/>
+                              </w:rPr>
+                            </w:pPr>
+                          </w:p>
+                        </w:tc>
+                        <w:tc>
+                          <w:tcPr>
+                            <w:tcW w:w="1321" w:type="dxa"/>
+                            <w:tcBorders>
+                              <w:top w:val="single" w:sz="4" w:space="0" w:color="auto"/>
+                              <w:left w:val="nil"/>
+                              <w:bottom w:val="nil"/>
+                              <w:right w:val="nil"/>
+                            </w:tcBorders>
+                          </w:tcPr>
+                          <w:p>
+                            <w:pPr>
+                              <w:rPr>
+                                <w:sz w:val="4"/>
+                                <w:szCs w:val="4"/>
+                              </w:rPr>
+                            </w:pPr>
+                          </w:p>
+                        </w:tc>
+                        <w:tc>
+                          <w:tcPr>
+                            <w:tcW w:w="387" w:type="dxa"/>
+                            <w:tcBorders>
+                              <w:top w:val="nil"/>
+                              <w:left w:val="nil"/>
+                              <w:bottom w:val="nil"/>
+                              <w:right w:val="nil"/>
+                            </w:tcBorders>
+                          </w:tcPr>
+                          <w:p>
+                            <w:pPr>
+                              <w:rPr>
+                                <w:sz w:val="4"/>
+                                <w:szCs w:val="4"/>
+                              </w:rPr>
+                            </w:pPr>
+                          </w:p>
+                        </w:tc>
+                        <w:tc>
+                          <w:tcPr>
+                            <w:tcW w:w="1172" w:type="dxa"/>
+                            <w:tcBorders>
+                              <w:top w:val="nil"/>
+                              <w:left w:val="nil"/>
+                              <w:bottom w:val="nil"/>
+                              <w:right w:val="nil"/>
+                            </w:tcBorders>
+                          </w:tcPr>
+                          <w:p>
+                            <w:pPr>
+                              <w:rPr>
+                                <w:sz w:val="4"/>
+                                <w:szCs w:val="4"/>
+                              </w:rPr>
+                            </w:pPr>
                           </w:p>
                         </w:tc>
                       </w:tr>
-                    </w:tbl>
-                    <w:p>
-                      <w:pPr>
-                        <w:jc w:val="center"/>
-                      </w:pPr>
-                    </w:p>
-                  </w:txbxContent>
-                </v:textbox>
-                <w10:wrap type="square"/>
-              </v:rect>
-            </w:pict>
-          </mc:Fallback>
-        </mc:AlternateContent>
-      </w:r>
-    </w:p>
-    <w:p>
-      <w:pPr>
-        <w:spacing w:before="0" w:after="0"/>
-        <w:ind w:firstLine="142"/>
-        <w:rPr>
-          <w:rFonts w:ascii="Calibri" w:hAnsi="Calibri" w:cs="Calibri"/>
-          <w:b/>
-          <w:caps/>
-          <w:noProof/>
-          <w:sz w:val="2"/>
-          <w:szCs w:val="2"/>
-        </w:rPr>
-      </w:pPr>
-    </w:p>
-    <w:p>
-      <w:pPr>
-        <w:spacing w:before="0" w:after="0"/>
-        <w:ind w:firstLine="142"/>
-        <w:rPr>
-          <w:rFonts w:ascii="Calibri" w:hAnsi="Calibri" w:cs="Calibri"/>
-          <w:b/>
-          <w:caps/>
-          <w:noProof/>
-          <w:sz w:val="2"/>
-          <w:szCs w:val="2"/>
-        </w:rPr>
-      </w:pPr>
-    </w:p>
-    <w:p>
-      <w:pPr>
-        <w:spacing w:before="0" w:after="0"/>
-        <w:ind w:firstLine="142"/>
-        <w:rPr>
-          <w:rFonts w:ascii="Calibri" w:hAnsi="Calibri" w:cs="Calibri"/>
-          <w:b/>
-          <w:caps/>
-          <w:noProof/>
-          <w:sz w:val="2"/>
-          <w:szCs w:val="2"/>
-        </w:rPr>
-      </w:pPr>
-      <w:r>
-        <w:rPr>
-          <w:rFonts w:ascii="Calibri" w:hAnsi="Calibri" w:cs="Calibri"/>
-          <w:b/>
-          <w:caps/>
-          <w:noProof/>
-          <w14:ligatures w14:val="standardContextual"/>
-        </w:rPr>
-        <mc:AlternateContent>
-          <mc:Choice Requires="wps">
-            <w:drawing>
-              <wp:anchor distT="0" distB="0" distL="114300" distR="114300" simplePos="0" relativeHeight="251666432" behindDoc="1" locked="0" layoutInCell="1" allowOverlap="1" wp14:anchorId="5990CF46" wp14:editId="444402E3">
-                <wp:simplePos x="0" y="0"/>
-                <wp:positionH relativeFrom="column">
-                  <wp:posOffset>635</wp:posOffset>
-                </wp:positionH>
-                <wp:positionV relativeFrom="paragraph">
-                  <wp:posOffset>4445</wp:posOffset>
-                </wp:positionV>
-                <wp:extent cx="2934970" cy="1109980"/>
-                <wp:effectExtent l="0" t="0" r="0" b="0"/>
-                <wp:wrapSquare wrapText="bothSides"/>
-                <wp:docPr id="821845427" name="Rectángulo 2"/>
-                <wp:cNvGraphicFramePr/>
-                <a:graphic xmlns:a="http://schemas.openxmlformats.org/drawingml/2006/main">
-                  <a:graphicData uri="http://schemas.microsoft.com/office/word/2010/wordprocessingShape">
-                    <wps:wsp>
-                      <wps:cNvSpPr/>
-                      <wps:spPr>
-                        <a:xfrm>
-                          <a:off x="0" y="0"/>
-                          <a:ext cx="2934970" cy="1109980"/>
-                        </a:xfrm>
-                        <a:prstGeom prst="rect">
-                          <a:avLst/>
-                        </a:prstGeom>
-                        <a:noFill/>
-                        <a:ln>
-                          <a:noFill/>
-                        </a:ln>
-                      </wps:spPr>
-                      <wps:style>
-                        <a:lnRef idx="0">
-                          <a:scrgbClr r="0" g="0" b="0"/>
-                        </a:lnRef>
-                        <a:fillRef idx="0">
-                          <a:scrgbClr r="0" g="0" b="0"/>
-                        </a:fillRef>
-                        <a:effectRef idx="0">
-                          <a:scrgbClr r="0" g="0" b="0"/>
-                        </a:effectRef>
-                        <a:fontRef idx="minor">
-                          <a:schemeClr val="dk1"/>
-                        </a:fontRef>
-                      </wps:style>
-                      <wps:txbx>
-                        <w:txbxContent>
-                          <w:tbl>
-                            <w:tblPr>
-                              <w:tblStyle w:val="Tablaconcuadrcula"/>
-                              <w:tblW w:w="0" w:type="auto"/>
-                              <w:tblLook w:val="04A0" w:firstRow="1" w:lastRow="0" w:firstColumn="1" w:lastColumn="0" w:noHBand="0" w:noVBand="1"/>
-                            </w:tblPr>
-                            <w:tblGrid>
-                              <w:gridCol w:w="988"/>
-                              <w:gridCol w:w="1097"/>
-                              <w:gridCol w:w="1171"/>
-                              <w:gridCol w:w="1067"/>
-                            </w:tblGrid>
-                            <w:tr>
-                              <w:tc>
-                                <w:tcPr>
-                                  <w:tcW w:w="4294" w:type="dxa"/>
-                                  <w:gridSpan w:val="4"/>
-                                  <w:tcBorders>
-                                    <w:right w:val="single" w:sz="4" w:space="0" w:color="auto"/>
-                                  </w:tcBorders>
-                                </w:tcPr>
-                                <w:p>
-                                  <w:pPr>
-                                    <w:spacing w:before="0" w:after="0"/>
-                                    <w:jc w:val="center"/>
-                                    <w:rPr>
-                                      <w:rFonts w:ascii="Calibri" w:hAnsi="Calibri" w:cs="Calibri"/>
-                                      <w:b/>
-                                      <w:caps/>
-                                      <w:noProof/>
-                                      <w:sz w:val="18"/>
-                                      <w:szCs w:val="18"/>
-                                    </w:rPr>
-                                  </w:pPr>
-                                  <w:r>
-                                    <w:rPr>
-                                      <w:sz w:val="18"/>
-                                      <w:szCs w:val="18"/>
-                                    </w:rPr>
-                                    <w:fldChar w:fldCharType="begin"/>
-                                  </w:r>
-                                  <w:r>
-                                    <w:rPr>
-                                      <w:sz w:val="18"/>
-                                      <w:szCs w:val="18"/>
-                                    </w:rPr>
-                                    <w:instrText xml:space="preserve"> MERGEFIELD  placa1  \* MERGEFORMAT </w:instrText>
-                                  </w:r>
-                                  <w:r>
-                                    <w:rPr>
-                                      <w:sz w:val="18"/>
-                                      <w:szCs w:val="18"/>
-                                    </w:rPr>
-                                    <w:fldChar w:fldCharType="separate"/>
-                                  </w:r>
-                                  <w:r>
-                                    <w:rPr>
-                                      <w:noProof/>
-                                      <w:sz w:val="18"/>
-                                      <w:szCs w:val="18"/>
-                                    </w:rPr>
-                                    <w:t>«placa1»</w:t>
-                                  </w:r>
-                                  <w:r>
-                                    <w:rPr>
-                                      <w:sz w:val="18"/>
-                                      <w:szCs w:val="18"/>
-                                    </w:rPr>
-                                    <w:fldChar w:fldCharType="end"/>
-                                  </w:r>
-                                </w:p>
-                              </w:tc>
-                            </w:tr>
-                            <w:tr>
-                              <w:tc>
-                                <w:tcPr>
-                                  <w:tcW w:w="988" w:type="dxa"/>
-                                </w:tcPr>
-                                <w:p>
-                                  <w:pPr>
-                                    <w:spacing w:before="0" w:after="0"/>
-                                    <w:jc w:val="center"/>
-                                    <w:rPr>
-                                      <w:rFonts w:ascii="Aptos Black" w:hAnsi="Aptos Black" w:cs="Calibri"/>
-                                      <w:b/>
-                                      <w:caps/>
-                                      <w:noProof/>
-                                      <w:sz w:val="18"/>
-                                      <w:szCs w:val="18"/>
-                                    </w:rPr>
-                                  </w:pPr>
-                                  <w:r>
-                                    <w:rPr>
-                                      <w:rFonts w:ascii="Aptos Black" w:hAnsi="Aptos Black" w:cs="Calibri"/>
-                                      <w:b/>
-                                      <w:caps/>
-                                      <w:noProof/>
-                                      <w:sz w:val="18"/>
-                                      <w:szCs w:val="18"/>
-                                    </w:rPr>
-                                    <w:t>VIAJE</w:t>
-                                  </w:r>
-                                </w:p>
-                              </w:tc>
-                              <w:tc>
-                                <w:tcPr>
-                                  <w:tcW w:w="1097" w:type="dxa"/>
-                                </w:tcPr>
-                                <w:p>
-                                  <w:pPr>
-                                    <w:spacing w:before="0" w:after="0"/>
-                                    <w:jc w:val="center"/>
-                                    <w:rPr>
-                                      <w:rFonts w:ascii="Aptos Black" w:hAnsi="Aptos Black" w:cs="Calibri"/>
-                                      <w:b/>
-                                      <w:caps/>
-                                      <w:noProof/>
-                                      <w:sz w:val="18"/>
-                                      <w:szCs w:val="18"/>
-                                    </w:rPr>
-                                  </w:pPr>
-                                  <w:r>
-                                    <w:rPr>
-                                      <w:rFonts w:ascii="Aptos Black" w:hAnsi="Aptos Black" w:cs="Calibri"/>
-                                      <w:b/>
-                                      <w:caps/>
-                                      <w:noProof/>
-                                      <w:sz w:val="18"/>
-                                      <w:szCs w:val="18"/>
-                                    </w:rPr>
-                                    <w:t>PESO BRUTO</w:t>
-                                  </w:r>
-                                </w:p>
-                              </w:tc>
-                              <w:tc>
-                                <w:tcPr>
-                                  <w:tcW w:w="1171" w:type="dxa"/>
-                                </w:tcPr>
-                                <w:p>
-                                  <w:pPr>
-                                    <w:spacing w:before="0" w:after="0"/>
-                                    <w:jc w:val="center"/>
-                                    <w:rPr>
-                                      <w:rFonts w:ascii="Aptos Black" w:hAnsi="Aptos Black" w:cs="Calibri"/>
-                                      <w:b/>
-                                      <w:caps/>
-                                      <w:noProof/>
-                                      <w:sz w:val="18"/>
-                                      <w:szCs w:val="18"/>
-                                    </w:rPr>
-                                  </w:pPr>
-                                  <w:r>
-                                    <w:rPr>
-                                      <w:rFonts w:ascii="Aptos Black" w:hAnsi="Aptos Black" w:cs="Calibri"/>
-                                      <w:b/>
-                                      <w:caps/>
-                                      <w:noProof/>
-                                      <w:sz w:val="18"/>
-                                      <w:szCs w:val="18"/>
-                                    </w:rPr>
-                                    <w:t>PESO NETO</w:t>
-                                  </w:r>
-                                </w:p>
-                              </w:tc>
-                              <w:tc>
-                                <w:tcPr>
-                                  <w:tcW w:w="1038" w:type="dxa"/>
-                                  <w:tcBorders>
-                                    <w:right w:val="single" w:sz="4" w:space="0" w:color="auto"/>
-                                  </w:tcBorders>
-                                </w:tcPr>
-                                <w:p>
-                                  <w:pPr>
-                                    <w:spacing w:before="0" w:after="0"/>
-                                    <w:jc w:val="center"/>
-                                    <w:rPr>
-                                      <w:rFonts w:ascii="Aptos Black" w:hAnsi="Aptos Black" w:cs="Calibri"/>
-                                      <w:b/>
-                                      <w:caps/>
-                                      <w:noProof/>
-                                      <w:sz w:val="18"/>
-                                      <w:szCs w:val="18"/>
-                                    </w:rPr>
-                                  </w:pPr>
-                                  <w:r>
-                                    <w:rPr>
-                                      <w:rFonts w:ascii="Aptos Black" w:hAnsi="Aptos Black" w:cs="Calibri"/>
-                                      <w:b/>
-                                      <w:caps/>
-                                      <w:noProof/>
-                                      <w:sz w:val="18"/>
-                                      <w:szCs w:val="18"/>
-                                    </w:rPr>
-                                    <w:t>TIPO</w:t>
-                                  </w:r>
-                                </w:p>
-                              </w:tc>
-                            </w:tr>
-                            <w:tr>
-                              <w:tc>
-                                <w:tcPr>
-                                  <w:tcW w:w="988" w:type="dxa"/>
-                                </w:tcPr>
-                                <w:p>
-                                  <w:pPr>
-                                    <w:spacing w:before="0" w:after="0"/>
-                                    <w:jc w:val="center"/>
-                                    <w:rPr>
-                                      <w:rFonts w:ascii="Aptos Black" w:hAnsi="Aptos Black" w:cs="Calibri"/>
-                                      <w:b/>
-                                      <w:caps/>
-                                      <w:noProof/>
-                                      <w:sz w:val="18"/>
-                                      <w:szCs w:val="18"/>
-                                    </w:rPr>
-                                  </w:pPr>
-                                  <w:r>
-                                    <w:rPr>
-                                      <w:rFonts w:ascii="Calibri" w:hAnsi="Calibri" w:cs="Calibri"/>
-                                      <w:b/>
-                                      <w:caps/>
-                                      <w:noProof/>
-                                      <w:sz w:val="2"/>
-                                      <w:szCs w:val="2"/>
-                                    </w:rPr>
-                                    <w:fldChar w:fldCharType="begin"/>
-                                  </w:r>
-                                  <w:r>
-                                    <w:rPr>
-                                      <w:rFonts w:ascii="Calibri" w:hAnsi="Calibri" w:cs="Calibri"/>
-                                      <w:b/>
-                                      <w:caps/>
-                                      <w:noProof/>
-                                      <w:sz w:val="2"/>
-                                      <w:szCs w:val="2"/>
-                                    </w:rPr>
-                                    <w:instrText xml:space="preserve"> MERGEFIELD  TableStart:placas1 \* Lower  \* MERGEFORMAT </w:instrText>
-                                  </w:r>
-                                  <w:r>
-                                    <w:rPr>
-                                      <w:rFonts w:ascii="Calibri" w:hAnsi="Calibri" w:cs="Calibri"/>
-                                      <w:b/>
-                                      <w:caps/>
-                                      <w:noProof/>
-                                      <w:sz w:val="2"/>
-                                      <w:szCs w:val="2"/>
-                                    </w:rPr>
-                                    <w:fldChar w:fldCharType="separate"/>
-                                  </w:r>
-                                  <w:r>
-                                    <w:rPr>
-                                      <w:rFonts w:ascii="Calibri" w:hAnsi="Calibri" w:cs="Calibri"/>
-                                      <w:b/>
-                                      <w:noProof/>
-                                      <w:sz w:val="2"/>
-                                      <w:szCs w:val="2"/>
-                                    </w:rPr>
-                                    <w:t>«tablestart:placas1»</w:t>
-                                  </w:r>
-                                  <w:r>
-                                    <w:rPr>
-                                      <w:rFonts w:ascii="Calibri" w:hAnsi="Calibri" w:cs="Calibri"/>
-                                      <w:b/>
-                                      <w:caps/>
-                                      <w:noProof/>
-                                      <w:sz w:val="2"/>
-                                      <w:szCs w:val="2"/>
-                                    </w:rPr>
-                                    <w:fldChar w:fldCharType="end"/>
-                                  </w:r>
-                                  <w:r>
-                                    <w:rPr>
-                                      <w:rFonts w:ascii="Calibri" w:hAnsi="Calibri" w:cs="Calibri"/>
-                                      <w:sz w:val="18"/>
-                                      <w:szCs w:val="18"/>
-                                    </w:rPr>
-                                    <w:fldChar w:fldCharType="begin"/>
-                                  </w:r>
-                                  <w:r>
-                                    <w:rPr>
-                                      <w:rFonts w:ascii="Calibri" w:hAnsi="Calibri" w:cs="Calibri"/>
-                                      <w:sz w:val="18"/>
-                                      <w:szCs w:val="18"/>
-                                    </w:rPr>
-                                    <w:instrText xml:space="preserve"> MERGEFIELD  item  \* MERGEFORMAT </w:instrText>
-                                  </w:r>
-                                  <w:r>
-                                    <w:rPr>
-                                      <w:rFonts w:ascii="Calibri" w:hAnsi="Calibri" w:cs="Calibri"/>
-                                      <w:sz w:val="18"/>
-                                      <w:szCs w:val="18"/>
-                                    </w:rPr>
-                                    <w:fldChar w:fldCharType="separate"/>
-                                  </w:r>
-                                  <w:r>
-                                    <w:rPr>
-                                      <w:rFonts w:ascii="Calibri" w:hAnsi="Calibri" w:cs="Calibri"/>
-                                      <w:noProof/>
-                                      <w:sz w:val="18"/>
-                                      <w:szCs w:val="18"/>
-                                    </w:rPr>
-                                    <w:t>«item»</w:t>
-                                  </w:r>
-                                  <w:r>
-                                    <w:rPr>
-                                      <w:rFonts w:ascii="Calibri" w:hAnsi="Calibri" w:cs="Calibri"/>
-                                      <w:sz w:val="18"/>
-                                      <w:szCs w:val="18"/>
-                                    </w:rPr>
-                                    <w:fldChar w:fldCharType="end"/>
-                                  </w:r>
-                                </w:p>
-                              </w:tc>
-                              <w:tc>
-                                <w:tcPr>
-                                  <w:tcW w:w="1097" w:type="dxa"/>
-                                </w:tcPr>
-                                <w:p>
-                                  <w:pPr>
-                                    <w:spacing w:before="0" w:after="0"/>
-                                    <w:jc w:val="center"/>
-                                    <w:rPr>
-                                      <w:rFonts w:ascii="Aptos Black" w:hAnsi="Aptos Black" w:cs="Calibri"/>
-                                      <w:b/>
-                                      <w:caps/>
-                                      <w:noProof/>
-                                      <w:sz w:val="18"/>
-                                      <w:szCs w:val="18"/>
-                                    </w:rPr>
-                                  </w:pPr>
-                                  <w:r>
-                                    <w:rPr>
-                                      <w:rFonts w:ascii="Calibri" w:hAnsi="Calibri" w:cs="Calibri"/>
-                                      <w:sz w:val="18"/>
-                                      <w:szCs w:val="18"/>
-                                    </w:rPr>
-                                    <w:fldChar w:fldCharType="begin"/>
-                                  </w:r>
-                                  <w:r>
-                                    <w:rPr>
-                                      <w:rFonts w:ascii="Calibri" w:hAnsi="Calibri" w:cs="Calibri"/>
-                                      <w:sz w:val="18"/>
-                                      <w:szCs w:val="18"/>
-                                    </w:rPr>
-                                    <w:instrText xml:space="preserve"> MERGEFIELD  p_bruto  \* MERGEFORMAT </w:instrText>
-                                  </w:r>
-                                  <w:r>
-                                    <w:rPr>
-                                      <w:rFonts w:ascii="Calibri" w:hAnsi="Calibri" w:cs="Calibri"/>
-                                      <w:sz w:val="18"/>
-                                      <w:szCs w:val="18"/>
-                                    </w:rPr>
-                                    <w:fldChar w:fldCharType="separate"/>
-                                  </w:r>
-                                  <w:r>
-                                    <w:rPr>
-                                      <w:rFonts w:ascii="Calibri" w:hAnsi="Calibri" w:cs="Calibri"/>
-                                      <w:noProof/>
-                                      <w:sz w:val="18"/>
-                                      <w:szCs w:val="18"/>
-                                    </w:rPr>
-                                    <w:t>«p_bruto»</w:t>
-                                  </w:r>
-                                  <w:r>
-                                    <w:rPr>
-                                      <w:rFonts w:ascii="Calibri" w:hAnsi="Calibri" w:cs="Calibri"/>
-                                      <w:sz w:val="18"/>
-                                      <w:szCs w:val="18"/>
-                                    </w:rPr>
-                                    <w:fldChar w:fldCharType="end"/>
-                                  </w:r>
-                                </w:p>
-                              </w:tc>
-                              <w:tc>
-                                <w:tcPr>
-                                  <w:tcW w:w="1171" w:type="dxa"/>
-                                </w:tcPr>
-                                <w:p>
-                                  <w:pPr>
-                                    <w:spacing w:before="0" w:after="0"/>
-                                    <w:jc w:val="center"/>
-                                    <w:rPr>
-                                      <w:rFonts w:ascii="Aptos Black" w:hAnsi="Aptos Black" w:cs="Calibri"/>
-                                      <w:b/>
-                                      <w:caps/>
-                                      <w:noProof/>
-                                      <w:sz w:val="18"/>
-                                      <w:szCs w:val="18"/>
-                                    </w:rPr>
-                                  </w:pPr>
-                                  <w:r>
-                                    <w:rPr>
-                                      <w:rFonts w:ascii="Calibri" w:hAnsi="Calibri" w:cs="Calibri"/>
-                                      <w:sz w:val="18"/>
-                                      <w:szCs w:val="18"/>
-                                    </w:rPr>
-                                    <w:fldChar w:fldCharType="begin"/>
-                                  </w:r>
-                                  <w:r>
-                                    <w:rPr>
-                                      <w:rFonts w:ascii="Calibri" w:hAnsi="Calibri" w:cs="Calibri"/>
-                                      <w:sz w:val="18"/>
-                                      <w:szCs w:val="18"/>
-                                    </w:rPr>
-                                    <w:instrText xml:space="preserve"> MERGEFIELD  pneto  \* MERGEFORMAT </w:instrText>
-                                  </w:r>
-                                  <w:r>
-                                    <w:rPr>
-                                      <w:rFonts w:ascii="Calibri" w:hAnsi="Calibri" w:cs="Calibri"/>
-                                      <w:sz w:val="18"/>
-                                      <w:szCs w:val="18"/>
-                                    </w:rPr>
-                                    <w:fldChar w:fldCharType="separate"/>
-                                  </w:r>
-                                  <w:r>
-                                    <w:rPr>
-                                      <w:rFonts w:ascii="Calibri" w:hAnsi="Calibri" w:cs="Calibri"/>
-                                      <w:noProof/>
-                                      <w:sz w:val="18"/>
-                                      <w:szCs w:val="18"/>
-                                    </w:rPr>
-                                    <w:t>«pneto»</w:t>
-                                  </w:r>
-                                  <w:r>
-                                    <w:rPr>
-                                      <w:rFonts w:ascii="Calibri" w:hAnsi="Calibri" w:cs="Calibri"/>
-                                      <w:sz w:val="18"/>
-                                      <w:szCs w:val="18"/>
-                                    </w:rPr>
-                                    <w:fldChar w:fldCharType="end"/>
-                                  </w:r>
-                                </w:p>
-                              </w:tc>
-                              <w:tc>
-                                <w:tcPr>
-                                  <w:tcW w:w="1038" w:type="dxa"/>
-                                  <w:tcBorders>
-                                    <w:right w:val="single" w:sz="4" w:space="0" w:color="auto"/>
-                                  </w:tcBorders>
-                                </w:tcPr>
-                                <w:p>
-                                  <w:pPr>
-                                    <w:spacing w:before="0" w:after="0"/>
-                                    <w:jc w:val="center"/>
-                                    <w:rPr>
-                                      <w:rFonts w:ascii="Aptos Black" w:hAnsi="Aptos Black" w:cs="Calibri"/>
-                                      <w:b/>
-                                      <w:caps/>
-                                      <w:noProof/>
-                                      <w:sz w:val="18"/>
-                                      <w:szCs w:val="18"/>
-                                    </w:rPr>
-                                  </w:pPr>
-                                  <w:r>
-                                    <w:rPr>
-                                      <w:rFonts w:ascii="Calibri" w:hAnsi="Calibri" w:cs="Calibri"/>
-                                      <w:sz w:val="18"/>
-                                      <w:szCs w:val="18"/>
-                                    </w:rPr>
-                                    <w:fldChar w:fldCharType="begin"/>
-                                  </w:r>
-                                  <w:r>
-                                    <w:rPr>
-                                      <w:rFonts w:ascii="Calibri" w:hAnsi="Calibri" w:cs="Calibri"/>
-                                      <w:sz w:val="18"/>
-                                      <w:szCs w:val="18"/>
-                                    </w:rPr>
-                                    <w:instrText xml:space="preserve"> MERGEFIELD  tipoley  \* MERGEFORMAT </w:instrText>
-                                  </w:r>
-                                  <w:r>
-                                    <w:rPr>
-                                      <w:rFonts w:ascii="Calibri" w:hAnsi="Calibri" w:cs="Calibri"/>
-                                      <w:sz w:val="18"/>
-                                      <w:szCs w:val="18"/>
-                                    </w:rPr>
-                                    <w:fldChar w:fldCharType="separate"/>
-                                  </w:r>
-                                  <w:r>
-                                    <w:rPr>
-                                      <w:rFonts w:ascii="Calibri" w:hAnsi="Calibri" w:cs="Calibri"/>
-                                      <w:noProof/>
-                                      <w:sz w:val="18"/>
-                                      <w:szCs w:val="18"/>
-                                    </w:rPr>
-                                    <w:t>«tipoley»</w:t>
-                                  </w:r>
-                                  <w:r>
-                                    <w:rPr>
-                                      <w:rFonts w:ascii="Calibri" w:hAnsi="Calibri" w:cs="Calibri"/>
-                                      <w:sz w:val="18"/>
-                                      <w:szCs w:val="18"/>
-                                    </w:rPr>
-                                    <w:fldChar w:fldCharType="end"/>
-                                  </w:r>
-                                  <w:r>
-                                    <w:rPr>
-                                      <w:rFonts w:ascii="Calibri" w:hAnsi="Calibri" w:cs="Calibri"/>
-                                      <w:b/>
-                                      <w:caps/>
-                                      <w:noProof/>
-                                      <w:sz w:val="2"/>
-                                      <w:szCs w:val="2"/>
-                                    </w:rPr>
-                                    <w:fldChar w:fldCharType="begin"/>
-                                  </w:r>
-                                  <w:r>
-                                    <w:rPr>
-                                      <w:rFonts w:ascii="Calibri" w:hAnsi="Calibri" w:cs="Calibri"/>
-                                      <w:b/>
-                                      <w:caps/>
-                                      <w:noProof/>
-                                      <w:sz w:val="2"/>
-                                      <w:szCs w:val="2"/>
-                                    </w:rPr>
-                                    <w:instrText xml:space="preserve"> MERGEFIELD  TableEnd:placas1 \* Lower  \* MERGEFORMAT </w:instrText>
-                                  </w:r>
-                                  <w:r>
-                                    <w:rPr>
-                                      <w:rFonts w:ascii="Calibri" w:hAnsi="Calibri" w:cs="Calibri"/>
-                                      <w:b/>
-                                      <w:caps/>
-                                      <w:noProof/>
-                                      <w:sz w:val="2"/>
-                                      <w:szCs w:val="2"/>
-                                    </w:rPr>
-                                    <w:fldChar w:fldCharType="separate"/>
-                                  </w:r>
-                                  <w:r>
-                                    <w:rPr>
-                                      <w:rFonts w:ascii="Calibri" w:hAnsi="Calibri" w:cs="Calibri"/>
-                                      <w:b/>
-                                      <w:noProof/>
-                                      <w:sz w:val="2"/>
-                                      <w:szCs w:val="2"/>
-                                    </w:rPr>
-                                    <w:t>«tableend:placas1»</w:t>
-                                  </w:r>
-                                  <w:r>
-                                    <w:rPr>
-                                      <w:rFonts w:ascii="Calibri" w:hAnsi="Calibri" w:cs="Calibri"/>
-                                      <w:b/>
-                                      <w:caps/>
-                                      <w:noProof/>
-                                      <w:sz w:val="2"/>
-                                      <w:szCs w:val="2"/>
-                                    </w:rPr>
-                                    <w:fldChar w:fldCharType="end"/>
-                                  </w:r>
-                                </w:p>
-                              </w:tc>
-                            </w:tr>
-                          </w:tbl>
-                          <w:p>
-                            <w:pPr>
-                              <w:spacing w:before="0" w:after="0"/>
-                              <w:rPr>
-                                <w:rFonts w:ascii="Calibri" w:hAnsi="Calibri" w:cs="Calibri"/>
-                                <w:b/>
-                                <w:caps/>
-                                <w:noProof/>
-                                <w:sz w:val="2"/>
-                                <w:szCs w:val="2"/>
-                              </w:rPr>
-                            </w:pPr>
-                          </w:p>
-                          <w:tbl>
-                            <w:tblPr>
-                              <w:tblStyle w:val="Tablaconcuadrcula"/>
-                              <w:tblW w:w="0" w:type="auto"/>
-                              <w:tblBorders>
-                                <w:top w:val="none" w:sz="0" w:space="0" w:color="auto"/>
-                                <w:left w:val="none" w:sz="0" w:space="0" w:color="auto"/>
-                                <w:bottom w:val="none" w:sz="0" w:space="0" w:color="auto"/>
-                                <w:right w:val="none" w:sz="0" w:space="0" w:color="auto"/>
-                                <w:insideH w:val="none" w:sz="0" w:space="0" w:color="auto"/>
-                                <w:insideV w:val="none" w:sz="0" w:space="0" w:color="auto"/>
-                              </w:tblBorders>
-                              <w:tblLook w:val="04A0" w:firstRow="1" w:lastRow="0" w:firstColumn="1" w:lastColumn="0" w:noHBand="0" w:noVBand="1"/>
-                            </w:tblPr>
-                            <w:tblGrid>
-                              <w:gridCol w:w="2081"/>
-                              <w:gridCol w:w="2213"/>
-                            </w:tblGrid>
-                            <w:tr>
-                              <w:tc>
-                                <w:tcPr>
-                                  <w:tcW w:w="2081" w:type="dxa"/>
-                                  <w:tcBorders>
-                                    <w:top w:val="single" w:sz="4" w:space="0" w:color="auto"/>
-                                  </w:tcBorders>
-                                </w:tcPr>
-                                <w:p>
-                                  <w:pPr>
-                                    <w:spacing w:before="0" w:after="0"/>
-                                    <w:rPr>
-                                      <w:rFonts w:ascii="Calibri" w:hAnsi="Calibri" w:cs="Calibri"/>
-                                      <w:b/>
-                                      <w:caps/>
-                                      <w:noProof/>
-                                      <w:sz w:val="18"/>
-                                      <w:szCs w:val="18"/>
-                                    </w:rPr>
-                                  </w:pPr>
-                                  <w:r>
-                                    <w:rPr>
-                                      <w:rFonts w:ascii="Calibri" w:hAnsi="Calibri" w:cs="Calibri"/>
-                                      <w:b/>
-                                      <w:caps/>
-                                      <w:noProof/>
-                                      <w:sz w:val="18"/>
-                                      <w:szCs w:val="18"/>
-                                    </w:rPr>
-                                    <w:t>SUB-TOTAL  – 1</w:t>
-                                  </w:r>
-                                </w:p>
-                              </w:tc>
-                              <w:tc>
-                                <w:tcPr>
-                                  <w:tcW w:w="2213" w:type="dxa"/>
-                                </w:tcPr>
-                                <w:p>
-                                  <w:pPr>
-                                    <w:spacing w:before="0" w:after="0"/>
-                                    <w:ind w:right="33"/>
-                                    <w:rPr>
-                                      <w:rFonts w:ascii="Calibri" w:hAnsi="Calibri" w:cs="Calibri"/>
-                                      <w:b/>
-                                      <w:bCs/>
-                                      <w:caps/>
-                                      <w:noProof/>
-                                    </w:rPr>
-                                  </w:pPr>
-                                  <w:r>
-                                    <w:rPr>
-                                      <w:rFonts w:ascii="Calibri" w:hAnsi="Calibri" w:cs="Calibri"/>
-                                      <w:b/>
-                                      <w:bCs/>
-                                    </w:rPr>
-                                    <w:fldChar w:fldCharType="begin"/>
-                                  </w:r>
-                                  <w:r>
-                                    <w:rPr>
-                                      <w:rFonts w:ascii="Calibri" w:hAnsi="Calibri" w:cs="Calibri"/>
-                                      <w:b/>
-                                      <w:bCs/>
-                                    </w:rPr>
-                                    <w:instrText xml:space="preserve"> MERGEFIELD  total_neto_placa1  \* MERGEFORMAT </w:instrText>
-                                  </w:r>
-                                  <w:r>
-                                    <w:rPr>
-                                      <w:rFonts w:ascii="Calibri" w:hAnsi="Calibri" w:cs="Calibri"/>
-                                      <w:b/>
-                                      <w:bCs/>
-                                    </w:rPr>
-                                    <w:fldChar w:fldCharType="separate"/>
-                                  </w:r>
-                                  <w:r>
-                                    <w:rPr>
-                                      <w:rFonts w:ascii="Calibri" w:hAnsi="Calibri" w:cs="Calibri"/>
-                                      <w:b/>
-                                      <w:bCs/>
-                                      <w:noProof/>
-                                    </w:rPr>
-                                    <w:t>«total_neto_placa1»</w:t>
-                                  </w:r>
-                                  <w:r>
-                                    <w:rPr>
-                                      <w:rFonts w:ascii="Calibri" w:hAnsi="Calibri" w:cs="Calibri"/>
-                                      <w:b/>
-                                      <w:bCs/>
-                                    </w:rPr>
-                                    <w:fldChar w:fldCharType="end"/>
-                                  </w:r>
-                                </w:p>
-                              </w:tc>
-                            </w:tr>
-                          </w:tbl>
-                          <w:p>
-                            <w:pPr>
-                              <w:jc w:val="center"/>
-                            </w:pPr>
-                          </w:p>
-                        </w:txbxContent>
-                      </wps:txbx>
-                      <wps:bodyPr rot="0" spcFirstLastPara="0" vertOverflow="overflow" horzOverflow="overflow" vert="horz" wrap="square" lIns="91440" tIns="45720" rIns="91440" bIns="45720" numCol="1" spcCol="0" rtlCol="0" fromWordArt="0" anchor="ctr" anchorCtr="0" forceAA="0" compatLnSpc="1">
-                        <a:prstTxWarp prst="textNoShape">
-                          <a:avLst/>
-                        </a:prstTxWarp>
-                        <a:noAutofit/>
-                      </wps:bodyPr>
-                    </wps:wsp>
-                  </a:graphicData>
-                </a:graphic>
-              </wp:anchor>
-            </w:drawing>
-          </mc:Choice>
-          <mc:Fallback>
-            <w:pict>
-              <v:rect w14:anchorId="5990CF46" id="_x0000_s1028" style="position:absolute;left:0;text-align:left;margin-left:.05pt;margin-top:.35pt;width:231.1pt;height:87.4pt;z-index:-251650048;visibility:visible;mso-wrap-style:square;mso-wrap-distance-left:9pt;mso-wrap-distance-top:0;mso-wrap-distance-right:9pt;mso-wrap-distance-bottom:0;mso-position-horizontal:absolute;mso-position-horizontal-relative:text;mso-position-vertical:absolute;mso-position-vertical-relative:text;v-text-anchor:middle" o:gfxdata="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" filled="f" stroked="f">
-                <v:textbox>
-                  <w:txbxContent>
-                    <w:tbl>
-                      <w:tblPr>
-                        <w:tblStyle w:val="Tablaconcuadrcula"/>
-                        <w:tblW w:w="0" w:type="auto"/>
-                        <w:tblLook w:val="04A0" w:firstRow="1" w:lastRow="0" w:firstColumn="1" w:lastColumn="0" w:noHBand="0" w:noVBand="1"/>
-                      </w:tblPr>
-                      <w:tblGrid>
-                        <w:gridCol w:w="988"/>
-                        <w:gridCol w:w="1097"/>
-                        <w:gridCol w:w="1171"/>
-                        <w:gridCol w:w="1067"/>
-                      </w:tblGrid>
                       <w:tr>
                         <w:tc>
                           <w:tcPr>
-                            <w:tcW w:w="4294" w:type="dxa"/>
-                            <w:gridSpan w:val="4"/>
+                            <w:tcW w:w="2263" w:type="dxa"/>
+                            <w:gridSpan w:val="2"/>
                             <w:tcBorders>
-                              <w:right w:val="single" w:sz="4" w:space="0" w:color="auto"/>
+                              <w:top w:val="single" w:sz="4" w:space="0" w:color="auto"/>
+                              <w:left w:val="nil"/>
+                              <w:bottom w:val="nil"/>
+                              <w:right w:val="nil"/>
                             </w:tcBorders>
                           </w:tcPr>
                           <w:p>
@@ -4790,147 +4293,32 @@
                               <w:rPr>
                                 <w:rFonts w:ascii="Calibri" w:hAnsi="Calibri" w:cs="Calibri"/>
                                 <w:b/>
-                                <w:caps/>
-                                <w:noProof/>
                                 <w:sz w:val="18"/>
                                 <w:szCs w:val="18"/>
                               </w:rPr>
                             </w:pPr>
                             <w:r>
                               <w:rPr>
-                                <w:sz w:val="18"/>
-                                <w:szCs w:val="18"/>
-                              </w:rPr>
-                              <w:fldChar w:fldCharType="begin"/>
-                            </w:r>
-                            <w:r>
-                              <w:rPr>
-                                <w:sz w:val="18"/>
-                                <w:szCs w:val="18"/>
-                              </w:rPr>
-                              <w:instrText xml:space="preserve"> MERGEFIELD  placa1  \* MERGEFORMAT </w:instrText>
-                            </w:r>
-                            <w:r>
-                              <w:rPr>
-                                <w:sz w:val="18"/>
-                                <w:szCs w:val="18"/>
-                              </w:rPr>
-                              <w:fldChar w:fldCharType="separate"/>
-                            </w:r>
-                            <w:r>
-                              <w:rPr>
-                                <w:noProof/>
-                                <w:sz w:val="18"/>
-                                <w:szCs w:val="18"/>
-                              </w:rPr>
-                              <w:t>«placa1»</w:t>
-                            </w:r>
-                            <w:r>
-                              <w:rPr>
-                                <w:sz w:val="18"/>
-                                <w:szCs w:val="18"/>
-                              </w:rPr>
-                              <w:fldChar w:fldCharType="end"/>
-                            </w:r>
-                          </w:p>
-                        </w:tc>
-                      </w:tr>
-                      <w:tr>
-                        <w:tc>
-                          <w:tcPr>
-                            <w:tcW w:w="988" w:type="dxa"/>
-                          </w:tcPr>
-                          <w:p>
-                            <w:pPr>
-                              <w:spacing w:before="0" w:after="0"/>
-                              <w:jc w:val="center"/>
-                              <w:rPr>
-                                <w:rFonts w:ascii="Aptos Black" w:hAnsi="Aptos Black" w:cs="Calibri"/>
+                                <w:rFonts w:ascii="Calibri" w:hAnsi="Calibri" w:cs="Calibri"/>
                                 <w:b/>
                                 <w:caps/>
                                 <w:noProof/>
-                                <w:sz w:val="18"/>
-                                <w:szCs w:val="18"/>
-                              </w:rPr>
-                            </w:pPr>
-                            <w:r>
-                              <w:rPr>
-                                <w:rFonts w:ascii="Aptos Black" w:hAnsi="Aptos Black" w:cs="Calibri"/>
-                                <w:b/>
-                                <w:caps/>
-                                <w:noProof/>
-                                <w:sz w:val="18"/>
-                                <w:szCs w:val="18"/>
-                              </w:rPr>
-                              <w:t>VIAJE</w:t>
+                                <w:sz w:val="22"/>
+                                <w:szCs w:val="22"/>
+                              </w:rPr>
+                              <w:t>SUB-TOTAL  – 1</w:t>
                             </w:r>
                           </w:p>
                         </w:tc>
                         <w:tc>
                           <w:tcPr>
-                            <w:tcW w:w="1097" w:type="dxa"/>
-                          </w:tcPr>
-                          <w:p>
-                            <w:pPr>
-                              <w:spacing w:before="0" w:after="0"/>
-                              <w:jc w:val="center"/>
-                              <w:rPr>
-                                <w:rFonts w:ascii="Aptos Black" w:hAnsi="Aptos Black" w:cs="Calibri"/>
-                                <w:b/>
-                                <w:caps/>
-                                <w:noProof/>
-                                <w:sz w:val="18"/>
-                                <w:szCs w:val="18"/>
-                              </w:rPr>
-                            </w:pPr>
-                            <w:r>
-                              <w:rPr>
-                                <w:rFonts w:ascii="Aptos Black" w:hAnsi="Aptos Black" w:cs="Calibri"/>
-                                <w:b/>
-                                <w:caps/>
-                                <w:noProof/>
-                                <w:sz w:val="18"/>
-                                <w:szCs w:val="18"/>
-                              </w:rPr>
-                              <w:t>PESO BRUTO</w:t>
-                            </w:r>
-                          </w:p>
-                        </w:tc>
-                        <w:tc>
-                          <w:tcPr>
-                            <w:tcW w:w="1171" w:type="dxa"/>
-                          </w:tcPr>
-                          <w:p>
-                            <w:pPr>
-                              <w:spacing w:before="0" w:after="0"/>
-                              <w:jc w:val="center"/>
-                              <w:rPr>
-                                <w:rFonts w:ascii="Aptos Black" w:hAnsi="Aptos Black" w:cs="Calibri"/>
-                                <w:b/>
-                                <w:caps/>
-                                <w:noProof/>
-                                <w:sz w:val="18"/>
-                                <w:szCs w:val="18"/>
-                              </w:rPr>
-                            </w:pPr>
-                            <w:r>
-                              <w:rPr>
-                                <w:rFonts w:ascii="Aptos Black" w:hAnsi="Aptos Black" w:cs="Calibri"/>
-                                <w:b/>
-                                <w:caps/>
-                                <w:noProof/>
-                                <w:sz w:val="18"/>
-                                <w:szCs w:val="18"/>
-                              </w:rPr>
-                              <w:t>PESO NETO</w:t>
-                            </w:r>
-                          </w:p>
-                        </w:tc>
-                        <w:tc>
-                          <w:tcPr>
-                            <w:tcW w:w="1038" w:type="dxa"/>
+                            <w:tcW w:w="2552" w:type="dxa"/>
+                            <w:gridSpan w:val="2"/>
                             <w:tcBorders>
-                              <w:right w:val="single" w:sz="4" w:space="0" w:color="auto"/>
+                              <w:top w:val="nil"/>
+                              <w:left w:val="nil"/>
+                              <w:bottom w:val="nil"/>
+                              <w:right w:val="nil"/>
                             </w:tcBorders>
                           </w:tcPr>
                           <w:p>
@@ -4938,54 +4326,19 @@
                               <w:spacing w:before="0" w:after="0"/>
                               <w:jc w:val="center"/>
                               <w:rPr>
-                                <w:rFonts w:ascii="Aptos Black" w:hAnsi="Aptos Black" w:cs="Calibri"/>
+                                <w:rFonts w:ascii="Calibri" w:hAnsi="Calibri" w:cs="Calibri"/>
                                 <w:b/>
-                                <w:caps/>
-                                <w:noProof/>
                                 <w:sz w:val="18"/>
                                 <w:szCs w:val="18"/>
                               </w:rPr>
                             </w:pPr>
                             <w:r>
                               <w:rPr>
-                                <w:rFonts w:ascii="Aptos Black" w:hAnsi="Aptos Black" w:cs="Calibri"/>
-                                <w:b/>
-                                <w:caps/>
-                                <w:noProof/>
-                                <w:sz w:val="18"/>
-                                <w:szCs w:val="18"/>
-                              </w:rPr>
-                              <w:t>TIPO</w:t>
-                            </w:r>
-                          </w:p>
-                        </w:tc>
-                      </w:tr>
-                      <w:tr>
-                        <w:tc>
-                          <w:tcPr>
-                            <w:tcW w:w="988" w:type="dxa"/>
-                          </w:tcPr>
-                          <w:p>
-                            <w:pPr>
-                              <w:spacing w:before="0" w:after="0"/>
-                              <w:jc w:val="center"/>
-                              <w:rPr>
-                                <w:rFonts w:ascii="Aptos Black" w:hAnsi="Aptos Black" w:cs="Calibri"/>
-                                <w:b/>
-                                <w:caps/>
-                                <w:noProof/>
-                                <w:sz w:val="18"/>
-                                <w:szCs w:val="18"/>
-                              </w:rPr>
-                            </w:pPr>
-                            <w:r>
-                              <w:rPr>
                                 <w:rFonts w:ascii="Calibri" w:hAnsi="Calibri" w:cs="Calibri"/>
                                 <w:b/>
-                                <w:caps/>
-                                <w:noProof/>
-                                <w:sz w:val="2"/>
-                                <w:szCs w:val="2"/>
+                                <w:bCs/>
+                                <w:sz w:val="22"/>
+                                <w:szCs w:val="22"/>
                               </w:rPr>
                               <w:fldChar w:fldCharType="begin"/>
                             </w:r>
@@ -4993,21 +4346,19 @@
                               <w:rPr>
                                 <w:rFonts w:ascii="Calibri" w:hAnsi="Calibri" w:cs="Calibri"/>
                                 <w:b/>
-                                <w:caps/>
-                                <w:noProof/>
-                                <w:sz w:val="2"/>
-                                <w:szCs w:val="2"/>
-                              </w:rPr>
-                              <w:instrText xml:space="preserve"> MERGEFIELD  TableStart:placas1 \* Lower  \* MERGEFORMAT </w:instrText>
+                                <w:bCs/>
+                                <w:sz w:val="22"/>
+                                <w:szCs w:val="22"/>
+                              </w:rPr>
+                              <w:instrText xml:space="preserve"> MERGEFIELD  total_neto_placa1  \* MERGEFORMAT </w:instrText>
                             </w:r>
                             <w:r>
                               <w:rPr>
                                 <w:rFonts w:ascii="Calibri" w:hAnsi="Calibri" w:cs="Calibri"/>
                                 <w:b/>
-                                <w:caps/>
-                                <w:noProof/>
-                                <w:sz w:val="2"/>
-                                <w:szCs w:val="2"/>
+                                <w:bCs/>
+                                <w:sz w:val="22"/>
+                                <w:szCs w:val="22"/>
                               </w:rPr>
                               <w:fldChar w:fldCharType="separate"/>
                             </w:r>
@@ -5015,61 +4366,20 @@
                               <w:rPr>
                                 <w:rFonts w:ascii="Calibri" w:hAnsi="Calibri" w:cs="Calibri"/>
                                 <w:b/>
+                                <w:bCs/>
                                 <w:noProof/>
-                                <w:sz w:val="2"/>
-                                <w:szCs w:val="2"/>
-                              </w:rPr>
-                              <w:t>«tablestart:placas1»</w:t>
+                                <w:sz w:val="22"/>
+                                <w:szCs w:val="22"/>
+                              </w:rPr>
+                              <w:t>«total_neto_placa1»</w:t>
                             </w:r>
                             <w:r>
                               <w:rPr>
                                 <w:rFonts w:ascii="Calibri" w:hAnsi="Calibri" w:cs="Calibri"/>
                                 <w:b/>
-                                <w:caps/>
-                                <w:noProof/>
-                                <w:sz w:val="2"/>
-                                <w:szCs w:val="2"/>
-                              </w:rPr>
-                              <w:fldChar w:fldCharType="end"/>
-                            </w:r>
-                            <w:r>
-                              <w:rPr>
-                                <w:rFonts w:ascii="Calibri" w:hAnsi="Calibri" w:cs="Calibri"/>
-                                <w:sz w:val="18"/>
-                                <w:szCs w:val="18"/>
-                              </w:rPr>
-                              <w:fldChar w:fldCharType="begin"/>
-                            </w:r>
-                            <w:r>
-                              <w:rPr>
-                                <w:rFonts w:ascii="Calibri" w:hAnsi="Calibri" w:cs="Calibri"/>
-                                <w:sz w:val="18"/>
-                                <w:szCs w:val="18"/>
-                              </w:rPr>
-                              <w:instrText xml:space="preserve"> MERGEFIELD  item  \* MERGEFORMAT </w:instrText>
-                            </w:r>
-                            <w:r>
-                              <w:rPr>
-                                <w:rFonts w:ascii="Calibri" w:hAnsi="Calibri" w:cs="Calibri"/>
-                                <w:sz w:val="18"/>
-                                <w:szCs w:val="18"/>
-                              </w:rPr>
-                              <w:fldChar w:fldCharType="separate"/>
-                            </w:r>
-                            <w:r>
-                              <w:rPr>
-                                <w:rFonts w:ascii="Calibri" w:hAnsi="Calibri" w:cs="Calibri"/>
-                                <w:noProof/>
-                                <w:sz w:val="18"/>
-                                <w:szCs w:val="18"/>
-                              </w:rPr>
-                              <w:t>«item»</w:t>
-                            </w:r>
-                            <w:r>
-                              <w:rPr>
-                                <w:rFonts w:ascii="Calibri" w:hAnsi="Calibri" w:cs="Calibri"/>
-                                <w:sz w:val="18"/>
-                                <w:szCs w:val="18"/>
+                                <w:bCs/>
+                                <w:sz w:val="22"/>
+                                <w:szCs w:val="22"/>
                               </w:rPr>
                               <w:fldChar w:fldCharType="end"/>
                             </w:r>
@@ -5077,129 +4387,12 @@
                         </w:tc>
                         <w:tc>
                           <w:tcPr>
-                            <w:tcW w:w="1097" w:type="dxa"/>
-                          </w:tcPr>
-                          <w:p>
-                            <w:pPr>
-                              <w:spacing w:before="0" w:after="0"/>
-                              <w:jc w:val="center"/>
-                              <w:rPr>
-                                <w:rFonts w:ascii="Aptos Black" w:hAnsi="Aptos Black" w:cs="Calibri"/>
-                                <w:b/>
-                                <w:caps/>
-                                <w:noProof/>
-                                <w:sz w:val="18"/>
-                                <w:szCs w:val="18"/>
-                              </w:rPr>
-                            </w:pPr>
-                            <w:r>
-                              <w:rPr>
-                                <w:rFonts w:ascii="Calibri" w:hAnsi="Calibri" w:cs="Calibri"/>
-                                <w:sz w:val="18"/>
-                                <w:szCs w:val="18"/>
-                              </w:rPr>
-                              <w:fldChar w:fldCharType="begin"/>
-                            </w:r>
-                            <w:r>
-                              <w:rPr>
-                                <w:rFonts w:ascii="Calibri" w:hAnsi="Calibri" w:cs="Calibri"/>
-                                <w:sz w:val="18"/>
-                                <w:szCs w:val="18"/>
-                              </w:rPr>
-                              <w:instrText xml:space="preserve"> MERGEFIELD  p_bruto  \* MERGEFORMAT </w:instrText>
-                            </w:r>
-                            <w:r>
-                              <w:rPr>
-                                <w:rFonts w:ascii="Calibri" w:hAnsi="Calibri" w:cs="Calibri"/>
-                                <w:sz w:val="18"/>
-                                <w:szCs w:val="18"/>
-                              </w:rPr>
-                              <w:fldChar w:fldCharType="separate"/>
-                            </w:r>
-                            <w:r>
-                              <w:rPr>
-                                <w:rFonts w:ascii="Calibri" w:hAnsi="Calibri" w:cs="Calibri"/>
-                                <w:noProof/>
-                                <w:sz w:val="18"/>
-                                <w:szCs w:val="18"/>
-                              </w:rPr>
-                              <w:t>«p_bruto»</w:t>
-                            </w:r>
-                            <w:r>
-                              <w:rPr>
-                                <w:rFonts w:ascii="Calibri" w:hAnsi="Calibri" w:cs="Calibri"/>
-                                <w:sz w:val="18"/>
-                                <w:szCs w:val="18"/>
-                              </w:rPr>
-                              <w:fldChar w:fldCharType="end"/>
-                            </w:r>
-                          </w:p>
-                        </w:tc>
-                        <w:tc>
-                          <w:tcPr>
-                            <w:tcW w:w="1171" w:type="dxa"/>
-                          </w:tcPr>
-                          <w:p>
-                            <w:pPr>
-                              <w:spacing w:before="0" w:after="0"/>
-                              <w:jc w:val="center"/>
-                              <w:rPr>
-                                <w:rFonts w:ascii="Aptos Black" w:hAnsi="Aptos Black" w:cs="Calibri"/>
-                                <w:b/>
-                                <w:caps/>
-                                <w:noProof/>
-                                <w:sz w:val="18"/>
-                                <w:szCs w:val="18"/>
-                              </w:rPr>
-                            </w:pPr>
-                            <w:r>
-                              <w:rPr>
-                                <w:rFonts w:ascii="Calibri" w:hAnsi="Calibri" w:cs="Calibri"/>
-                                <w:sz w:val="18"/>
-                                <w:szCs w:val="18"/>
-                              </w:rPr>
-                              <w:fldChar w:fldCharType="begin"/>
-                            </w:r>
-                            <w:r>
-                              <w:rPr>
-                                <w:rFonts w:ascii="Calibri" w:hAnsi="Calibri" w:cs="Calibri"/>
-                                <w:sz w:val="18"/>
-                                <w:szCs w:val="18"/>
-                              </w:rPr>
-                              <w:instrText xml:space="preserve"> MERGEFIELD  pneto  \* MERGEFORMAT </w:instrText>
-                            </w:r>
-                            <w:r>
-                              <w:rPr>
-                                <w:rFonts w:ascii="Calibri" w:hAnsi="Calibri" w:cs="Calibri"/>
-                                <w:sz w:val="18"/>
-                                <w:szCs w:val="18"/>
-                              </w:rPr>
-                              <w:fldChar w:fldCharType="separate"/>
-                            </w:r>
-                            <w:r>
-                              <w:rPr>
-                                <w:rFonts w:ascii="Calibri" w:hAnsi="Calibri" w:cs="Calibri"/>
-                                <w:noProof/>
-                                <w:sz w:val="18"/>
-                                <w:szCs w:val="18"/>
-                              </w:rPr>
-                              <w:t>«pneto»</w:t>
-                            </w:r>
-                            <w:r>
-                              <w:rPr>
-                                <w:rFonts w:ascii="Calibri" w:hAnsi="Calibri" w:cs="Calibri"/>
-                                <w:sz w:val="18"/>
-                                <w:szCs w:val="18"/>
-                              </w:rPr>
-                              <w:fldChar w:fldCharType="end"/>
-                            </w:r>
-                          </w:p>
-                        </w:tc>
-                        <w:tc>
-                          <w:tcPr>
-                            <w:tcW w:w="1038" w:type="dxa"/>
+                            <w:tcW w:w="387" w:type="dxa"/>
                             <w:tcBorders>
-                              <w:right w:val="single" w:sz="4" w:space="0" w:color="auto"/>
+                              <w:top w:val="nil"/>
+                              <w:left w:val="nil"/>
+                              <w:bottom w:val="nil"/>
+                              <w:right w:val="nil"/>
                             </w:tcBorders>
                           </w:tcPr>
                           <w:p>
@@ -5207,246 +4400,45 @@
                               <w:spacing w:before="0" w:after="0"/>
                               <w:jc w:val="center"/>
                               <w:rPr>
-                                <w:rFonts w:ascii="Aptos Black" w:hAnsi="Aptos Black" w:cs="Calibri"/>
-                                <w:b/>
-                                <w:caps/>
-                                <w:noProof/>
-                                <w:sz w:val="18"/>
-                                <w:szCs w:val="18"/>
-                              </w:rPr>
-                            </w:pPr>
-                            <w:r>
-                              <w:rPr>
-                                <w:rFonts w:ascii="Calibri" w:hAnsi="Calibri" w:cs="Calibri"/>
-                                <w:sz w:val="18"/>
-                                <w:szCs w:val="18"/>
-                              </w:rPr>
-                              <w:fldChar w:fldCharType="begin"/>
-                            </w:r>
-                            <w:r>
-                              <w:rPr>
-                                <w:rFonts w:ascii="Calibri" w:hAnsi="Calibri" w:cs="Calibri"/>
-                                <w:sz w:val="18"/>
-                                <w:szCs w:val="18"/>
-                              </w:rPr>
-                              <w:instrText xml:space="preserve"> MERGEFIELD  tipoley  \* MERGEFORMAT </w:instrText>
-                            </w:r>
-                            <w:r>
-                              <w:rPr>
-                                <w:rFonts w:ascii="Calibri" w:hAnsi="Calibri" w:cs="Calibri"/>
-                                <w:sz w:val="18"/>
-                                <w:szCs w:val="18"/>
-                              </w:rPr>
-                              <w:fldChar w:fldCharType="separate"/>
-                            </w:r>
-                            <w:r>
-                              <w:rPr>
-                                <w:rFonts w:ascii="Calibri" w:hAnsi="Calibri" w:cs="Calibri"/>
-                                <w:noProof/>
-                                <w:sz w:val="18"/>
-                                <w:szCs w:val="18"/>
-                              </w:rPr>
-                              <w:t>«tipoley»</w:t>
-                            </w:r>
-                            <w:r>
-                              <w:rPr>
-                                <w:rFonts w:ascii="Calibri" w:hAnsi="Calibri" w:cs="Calibri"/>
-                                <w:sz w:val="18"/>
-                                <w:szCs w:val="18"/>
-                              </w:rPr>
-                              <w:fldChar w:fldCharType="end"/>
-                            </w:r>
-                            <w:r>
-                              <w:rPr>
                                 <w:rFonts w:ascii="Calibri" w:hAnsi="Calibri" w:cs="Calibri"/>
                                 <w:b/>
-                                <w:caps/>
-                                <w:noProof/>
-                                <w:sz w:val="2"/>
-                                <w:szCs w:val="2"/>
-                              </w:rPr>
-                              <w:fldChar w:fldCharType="begin"/>
-                            </w:r>
-                            <w:r>
-                              <w:rPr>
-                                <w:rFonts w:ascii="Calibri" w:hAnsi="Calibri" w:cs="Calibri"/>
-                                <w:b/>
-                                <w:caps/>
-                                <w:noProof/>
-                                <w:sz w:val="2"/>
-                                <w:szCs w:val="2"/>
-                              </w:rPr>
-                              <w:instrText xml:space="preserve"> MERGEFIELD  TableEnd:placas1 \* Lower  \* MERGEFORMAT </w:instrText>
-                            </w:r>
-                            <w:r>
-                              <w:rPr>
-                                <w:rFonts w:ascii="Calibri" w:hAnsi="Calibri" w:cs="Calibri"/>
-                                <w:b/>
-                                <w:caps/>
-                                <w:noProof/>
-                                <w:sz w:val="2"/>
-                                <w:szCs w:val="2"/>
-                              </w:rPr>
-                              <w:fldChar w:fldCharType="separate"/>
-                            </w:r>
-                            <w:r>
-                              <w:rPr>
-                                <w:rFonts w:ascii="Calibri" w:hAnsi="Calibri" w:cs="Calibri"/>
-                                <w:b/>
-                                <w:noProof/>
-                                <w:sz w:val="2"/>
-                                <w:szCs w:val="2"/>
-                              </w:rPr>
-                              <w:t>«tableend:placas1»</w:t>
-                            </w:r>
-                            <w:r>
-                              <w:rPr>
-                                <w:rFonts w:ascii="Calibri" w:hAnsi="Calibri" w:cs="Calibri"/>
-                                <w:b/>
-                                <w:caps/>
-                                <w:noProof/>
-                                <w:sz w:val="2"/>
-                                <w:szCs w:val="2"/>
-                              </w:rPr>
-                              <w:fldChar w:fldCharType="end"/>
-                            </w:r>
+                                <w:bCs/>
+                                <w:sz w:val="22"/>
+                                <w:szCs w:val="22"/>
+                              </w:rPr>
+                            </w:pPr>
                           </w:p>
                         </w:tc>
-                      </w:tr>
-                    </w:tbl>
-                    <w:p>
-                      <w:pPr>
-                        <w:spacing w:before="0" w:after="0"/>
-                        <w:rPr>
-                          <w:rFonts w:ascii="Calibri" w:hAnsi="Calibri" w:cs="Calibri"/>
-                          <w:b/>
-                          <w:caps/>
-                          <w:noProof/>
-                          <w:sz w:val="2"/>
-                          <w:szCs w:val="2"/>
-                        </w:rPr>
-                      </w:pPr>
-                    </w:p>
-                    <w:tbl>
-                      <w:tblPr>
-                        <w:tblStyle w:val="Tablaconcuadrcula"/>
-                        <w:tblW w:w="0" w:type="auto"/>
-                        <w:tblBorders>
-                          <w:top w:val="none" w:sz="0" w:space="0" w:color="auto"/>
-                          <w:left w:val="none" w:sz="0" w:space="0" w:color="auto"/>
-                          <w:bottom w:val="none" w:sz="0" w:space="0" w:color="auto"/>
-                          <w:right w:val="none" w:sz="0" w:space="0" w:color="auto"/>
-                          <w:insideH w:val="none" w:sz="0" w:space="0" w:color="auto"/>
-                          <w:insideV w:val="none" w:sz="0" w:space="0" w:color="auto"/>
-                        </w:tblBorders>
-                        <w:tblLook w:val="04A0" w:firstRow="1" w:lastRow="0" w:firstColumn="1" w:lastColumn="0" w:noHBand="0" w:noVBand="1"/>
-                      </w:tblPr>
-                      <w:tblGrid>
-                        <w:gridCol w:w="2081"/>
-                        <w:gridCol w:w="2213"/>
-                      </w:tblGrid>
-                      <w:tr>
                         <w:tc>
                           <w:tcPr>
-                            <w:tcW w:w="2081" w:type="dxa"/>
+                            <w:tcW w:w="1172" w:type="dxa"/>
                             <w:tcBorders>
-                              <w:top w:val="single" w:sz="4" w:space="0" w:color="auto"/>
+                              <w:top w:val="nil"/>
+                              <w:left w:val="nil"/>
+                              <w:bottom w:val="nil"/>
+                              <w:right w:val="nil"/>
                             </w:tcBorders>
                           </w:tcPr>
                           <w:p>
                             <w:pPr>
                               <w:spacing w:before="0" w:after="0"/>
-                              <w:rPr>
-                                <w:rFonts w:ascii="Calibri" w:hAnsi="Calibri" w:cs="Calibri"/>
-                                <w:b/>
-                                <w:caps/>
-                                <w:noProof/>
-                                <w:sz w:val="18"/>
-                                <w:szCs w:val="18"/>
-                              </w:rPr>
-                            </w:pPr>
-                            <w:r>
-                              <w:rPr>
-                                <w:rFonts w:ascii="Calibri" w:hAnsi="Calibri" w:cs="Calibri"/>
-                                <w:b/>
-                                <w:caps/>
-                                <w:noProof/>
-                                <w:sz w:val="18"/>
-                                <w:szCs w:val="18"/>
-                              </w:rPr>
-                              <w:t>SUB-TOTAL  – 1</w:t>
-                            </w:r>
-                          </w:p>
-                        </w:tc>
-                        <w:tc>
-                          <w:tcPr>
-                            <w:tcW w:w="2213" w:type="dxa"/>
-                          </w:tcPr>
-                          <w:p>
-                            <w:pPr>
-                              <w:spacing w:before="0" w:after="0"/>
-                              <w:ind w:right="33"/>
+                              <w:jc w:val="center"/>
                               <w:rPr>
                                 <w:rFonts w:ascii="Calibri" w:hAnsi="Calibri" w:cs="Calibri"/>
                                 <w:b/>
                                 <w:bCs/>
-                                <w:caps/>
-                                <w:noProof/>
+                                <w:sz w:val="22"/>
+                                <w:szCs w:val="22"/>
                               </w:rPr>
                             </w:pPr>
-                            <w:r>
-                              <w:rPr>
-                                <w:rFonts w:ascii="Calibri" w:hAnsi="Calibri" w:cs="Calibri"/>
-                                <w:b/>
-                                <w:bCs/>
-                              </w:rPr>
-                              <w:fldChar w:fldCharType="begin"/>
-                            </w:r>
-                            <w:r>
-                              <w:rPr>
-                                <w:rFonts w:ascii="Calibri" w:hAnsi="Calibri" w:cs="Calibri"/>
-                                <w:b/>
-                                <w:bCs/>
-                              </w:rPr>
-                              <w:instrText xml:space="preserve"> MERGEFIELD  total_neto_placa1  \* MERGEFORMAT </w:instrText>
-                            </w:r>
-                            <w:r>
-                              <w:rPr>
-                                <w:rFonts w:ascii="Calibri" w:hAnsi="Calibri" w:cs="Calibri"/>
-                                <w:b/>
-                                <w:bCs/>
-                              </w:rPr>
-                              <w:fldChar w:fldCharType="separate"/>
-                            </w:r>
-                            <w:r>
-                              <w:rPr>
-                                <w:rFonts w:ascii="Calibri" w:hAnsi="Calibri" w:cs="Calibri"/>
-                                <w:b/>
-                                <w:bCs/>
-                                <w:noProof/>
-                              </w:rPr>
-                              <w:t>«total_neto_placa1»</w:t>
-                            </w:r>
-                            <w:r>
-                              <w:rPr>
-                                <w:rFonts w:ascii="Calibri" w:hAnsi="Calibri" w:cs="Calibri"/>
-                                <w:b/>
-                                <w:bCs/>
-                              </w:rPr>
-                              <w:fldChar w:fldCharType="end"/>
-                            </w:r>
                           </w:p>
                         </w:tc>
                       </w:tr>
                     </w:tbl>
-                    <w:p>
-                      <w:pPr>
-                        <w:jc w:val="center"/>
-                      </w:pPr>
-                    </w:p>
+                    <w:p/>
                   </w:txbxContent>
                 </v:textbox>
-                <w10:wrap type="square"/>
+                <w10:wrap type="topAndBottom"/>
               </v:rect>
             </w:pict>
           </mc:Fallback>
@@ -5663,362 +4655,6 @@
         </w:rPr>
       </w:pPr>
     </w:p>
-    <w:p>
-      <w:pPr>
-        <w:spacing w:before="0" w:after="0"/>
-        <w:ind w:firstLine="142"/>
-        <w:rPr>
-          <w:rFonts w:ascii="Calibri" w:hAnsi="Calibri" w:cs="Calibri"/>
-          <w:b/>
-          <w:caps/>
-          <w:noProof/>
-          <w:sz w:val="2"/>
-          <w:szCs w:val="2"/>
-        </w:rPr>
-      </w:pPr>
-    </w:p>
-    <w:p>
-      <w:pPr>
-        <w:spacing w:before="0" w:after="0"/>
-        <w:ind w:firstLine="142"/>
-        <w:rPr>
-          <w:rFonts w:ascii="Calibri" w:hAnsi="Calibri" w:cs="Calibri"/>
-          <w:b/>
-          <w:caps/>
-          <w:noProof/>
-          <w:sz w:val="2"/>
-          <w:szCs w:val="2"/>
-        </w:rPr>
-      </w:pPr>
-    </w:p>
-    <w:p>
-      <w:pPr>
-        <w:spacing w:before="0" w:after="0"/>
-        <w:ind w:firstLine="142"/>
-        <w:rPr>
-          <w:rFonts w:ascii="Calibri" w:hAnsi="Calibri" w:cs="Calibri"/>
-          <w:b/>
-          <w:caps/>
-          <w:noProof/>
-          <w:sz w:val="2"/>
-          <w:szCs w:val="2"/>
-        </w:rPr>
-      </w:pPr>
-    </w:p>
-    <w:p>
-      <w:pPr>
-        <w:spacing w:before="0" w:after="0"/>
-        <w:ind w:firstLine="142"/>
-        <w:rPr>
-          <w:rFonts w:ascii="Calibri" w:hAnsi="Calibri" w:cs="Calibri"/>
-          <w:b/>
-          <w:caps/>
-          <w:noProof/>
-          <w:sz w:val="2"/>
-          <w:szCs w:val="2"/>
-        </w:rPr>
-      </w:pPr>
-    </w:p>
-    <w:p>
-      <w:pPr>
-        <w:spacing w:before="0" w:after="0"/>
-        <w:ind w:firstLine="142"/>
-        <w:rPr>
-          <w:rFonts w:ascii="Calibri" w:hAnsi="Calibri" w:cs="Calibri"/>
-          <w:b/>
-          <w:caps/>
-          <w:noProof/>
-          <w:sz w:val="2"/>
-          <w:szCs w:val="2"/>
-        </w:rPr>
-      </w:pPr>
-    </w:p>
-    <w:p>
-      <w:pPr>
-        <w:spacing w:before="0" w:after="0"/>
-        <w:ind w:firstLine="142"/>
-        <w:rPr>
-          <w:rFonts w:ascii="Calibri" w:hAnsi="Calibri" w:cs="Calibri"/>
-          <w:b/>
-          <w:caps/>
-          <w:noProof/>
-          <w:sz w:val="2"/>
-          <w:szCs w:val="2"/>
-        </w:rPr>
-      </w:pPr>
-    </w:p>
-    <w:p>
-      <w:pPr>
-        <w:spacing w:before="0" w:after="0"/>
-        <w:ind w:firstLine="142"/>
-        <w:rPr>
-          <w:rFonts w:ascii="Calibri" w:hAnsi="Calibri" w:cs="Calibri"/>
-          <w:b/>
-          <w:caps/>
-          <w:noProof/>
-          <w:sz w:val="2"/>
-          <w:szCs w:val="2"/>
-        </w:rPr>
-      </w:pPr>
-    </w:p>
-    <w:p>
-      <w:pPr>
-        <w:spacing w:before="0" w:after="0"/>
-        <w:ind w:firstLine="142"/>
-        <w:rPr>
-          <w:rFonts w:ascii="Calibri" w:hAnsi="Calibri" w:cs="Calibri"/>
-          <w:b/>
-          <w:caps/>
-          <w:noProof/>
-          <w:sz w:val="2"/>
-          <w:szCs w:val="2"/>
-        </w:rPr>
-      </w:pPr>
-    </w:p>
-    <w:p>
-      <w:pPr>
-        <w:spacing w:before="0" w:after="0"/>
-        <w:ind w:firstLine="142"/>
-        <w:rPr>
-          <w:rFonts w:ascii="Calibri" w:hAnsi="Calibri" w:cs="Calibri"/>
-          <w:b/>
-          <w:caps/>
-          <w:noProof/>
-          <w:sz w:val="2"/>
-          <w:szCs w:val="2"/>
-        </w:rPr>
-      </w:pPr>
-    </w:p>
-    <w:p>
-      <w:pPr>
-        <w:spacing w:before="0" w:after="0"/>
-        <w:ind w:firstLine="142"/>
-        <w:rPr>
-          <w:rFonts w:ascii="Calibri" w:hAnsi="Calibri" w:cs="Calibri"/>
-          <w:b/>
-          <w:caps/>
-          <w:noProof/>
-          <w:sz w:val="2"/>
-          <w:szCs w:val="2"/>
-        </w:rPr>
-      </w:pPr>
-    </w:p>
-    <w:p>
-      <w:pPr>
-        <w:spacing w:before="0" w:after="0"/>
-        <w:ind w:firstLine="142"/>
-        <w:rPr>
-          <w:rFonts w:ascii="Calibri" w:hAnsi="Calibri" w:cs="Calibri"/>
-          <w:b/>
-          <w:caps/>
-          <w:noProof/>
-          <w:sz w:val="2"/>
-          <w:szCs w:val="2"/>
-        </w:rPr>
-      </w:pPr>
-    </w:p>
-    <w:p>
-      <w:pPr>
-        <w:spacing w:before="0" w:after="0"/>
-        <w:rPr>
-          <w:rFonts w:ascii="Calibri" w:hAnsi="Calibri" w:cs="Calibri"/>
-          <w:b/>
-          <w:caps/>
-          <w:noProof/>
-          <w:sz w:val="2"/>
-          <w:szCs w:val="2"/>
-        </w:rPr>
-      </w:pPr>
-    </w:p>
-    <w:p>
-      <w:pPr>
-        <w:spacing w:before="0" w:after="0"/>
-        <w:rPr>
-          <w:rFonts w:ascii="Calibri" w:hAnsi="Calibri" w:cs="Calibri"/>
-          <w:b/>
-          <w:caps/>
-          <w:noProof/>
-          <w:sz w:val="2"/>
-          <w:szCs w:val="2"/>
-        </w:rPr>
-      </w:pPr>
-    </w:p>
-    <w:p>
-      <w:pPr>
-        <w:spacing w:before="0" w:after="0"/>
-        <w:rPr>
-          <w:rFonts w:ascii="Calibri" w:hAnsi="Calibri" w:cs="Calibri"/>
-          <w:b/>
-          <w:caps/>
-          <w:noProof/>
-          <w:sz w:val="2"/>
-          <w:szCs w:val="2"/>
-        </w:rPr>
-      </w:pPr>
-    </w:p>
-    <w:p>
-      <w:pPr>
-        <w:spacing w:before="0" w:after="0"/>
-        <w:rPr>
-          <w:rFonts w:ascii="Calibri" w:hAnsi="Calibri" w:cs="Calibri"/>
-          <w:b/>
-          <w:caps/>
-          <w:noProof/>
-          <w:sz w:val="2"/>
-          <w:szCs w:val="2"/>
-        </w:rPr>
-      </w:pPr>
-    </w:p>
-    <w:p>
-      <w:pPr>
-        <w:spacing w:before="0" w:after="0"/>
-        <w:rPr>
-          <w:rFonts w:ascii="Calibri" w:hAnsi="Calibri" w:cs="Calibri"/>
-          <w:b/>
-          <w:caps/>
-          <w:noProof/>
-          <w:sz w:val="2"/>
-          <w:szCs w:val="2"/>
-        </w:rPr>
-      </w:pPr>
-    </w:p>
-    <w:p>
-      <w:pPr>
-        <w:spacing w:before="0" w:after="0"/>
-        <w:rPr>
-          <w:rFonts w:ascii="Calibri" w:hAnsi="Calibri" w:cs="Calibri"/>
-          <w:b/>
-          <w:caps/>
-          <w:noProof/>
-          <w:sz w:val="2"/>
-          <w:szCs w:val="2"/>
-        </w:rPr>
-      </w:pPr>
-    </w:p>
-    <w:p>
-      <w:pPr>
-        <w:spacing w:before="0" w:after="0"/>
-        <w:rPr>
-          <w:rFonts w:ascii="Calibri" w:hAnsi="Calibri" w:cs="Calibri"/>
-          <w:b/>
-          <w:caps/>
-          <w:noProof/>
-          <w:sz w:val="2"/>
-          <w:szCs w:val="2"/>
-        </w:rPr>
-      </w:pPr>
-    </w:p>
-    <w:p>
-      <w:pPr>
-        <w:spacing w:before="0" w:after="0"/>
-        <w:rPr>
-          <w:rFonts w:ascii="Calibri" w:hAnsi="Calibri" w:cs="Calibri"/>
-          <w:b/>
-          <w:caps/>
-          <w:noProof/>
-          <w:sz w:val="2"/>
-          <w:szCs w:val="2"/>
-        </w:rPr>
-      </w:pPr>
-    </w:p>
-    <w:p>
-      <w:pPr>
-        <w:spacing w:before="0" w:after="0"/>
-        <w:rPr>
-          <w:rFonts w:ascii="Calibri" w:hAnsi="Calibri" w:cs="Calibri"/>
-          <w:b/>
-          <w:caps/>
-          <w:noProof/>
-          <w:sz w:val="2"/>
-          <w:szCs w:val="2"/>
-        </w:rPr>
-      </w:pPr>
-    </w:p>
-    <w:p>
-      <w:pPr>
-        <w:spacing w:before="0" w:after="0"/>
-        <w:rPr>
-          <w:rFonts w:ascii="Calibri" w:hAnsi="Calibri" w:cs="Calibri"/>
-          <w:b/>
-          <w:caps/>
-          <w:noProof/>
-          <w:sz w:val="2"/>
-          <w:szCs w:val="2"/>
-        </w:rPr>
-      </w:pPr>
-    </w:p>
-    <w:p>
-      <w:pPr>
-        <w:spacing w:before="0" w:after="0"/>
-        <w:rPr>
-          <w:rFonts w:ascii="Calibri" w:hAnsi="Calibri" w:cs="Calibri"/>
-          <w:b/>
-          <w:caps/>
-          <w:noProof/>
-          <w:sz w:val="2"/>
-          <w:szCs w:val="2"/>
-        </w:rPr>
-      </w:pPr>
-    </w:p>
-    <w:p>
-      <w:pPr>
-        <w:spacing w:before="0" w:after="0"/>
-        <w:rPr>
-          <w:rFonts w:ascii="Calibri" w:hAnsi="Calibri" w:cs="Calibri"/>
-          <w:b/>
-          <w:caps/>
-          <w:noProof/>
-          <w:sz w:val="2"/>
-          <w:szCs w:val="2"/>
-        </w:rPr>
-      </w:pPr>
-    </w:p>
-    <w:p>
-      <w:pPr>
-        <w:spacing w:before="0" w:after="0"/>
-        <w:rPr>
-          <w:rFonts w:ascii="Calibri" w:hAnsi="Calibri" w:cs="Calibri"/>
-          <w:b/>
-          <w:caps/>
-          <w:noProof/>
-          <w:sz w:val="2"/>
-          <w:szCs w:val="2"/>
-        </w:rPr>
-      </w:pPr>
-    </w:p>
-    <w:p>
-      <w:pPr>
-        <w:spacing w:before="0" w:after="0"/>
-        <w:rPr>
-          <w:rFonts w:ascii="Calibri" w:hAnsi="Calibri" w:cs="Calibri"/>
-          <w:b/>
-          <w:caps/>
-          <w:noProof/>
-        </w:rPr>
-      </w:pPr>
-    </w:p>
-    <w:p>
-      <w:pPr>
-        <w:spacing w:before="0" w:after="0"/>
-        <w:rPr>
-          <w:rFonts w:ascii="Calibri" w:hAnsi="Calibri" w:cs="Calibri"/>
-          <w:b/>
-          <w:caps/>
-          <w:noProof/>
-        </w:rPr>
-      </w:pPr>
-    </w:p>
-    <w:p>
-      <w:pPr>
-        <w:spacing w:before="0" w:after="0"/>
-        <w:rPr>
-          <w:rFonts w:ascii="Calibri" w:hAnsi="Calibri" w:cs="Calibri"/>
-          <w:b/>
-          <w:caps/>
-          <w:noProof/>
-        </w:rPr>
-      </w:pPr>
-    </w:p>
     <w:tbl>
       <w:tblPr>
         <w:tblStyle w:val="Tablaconcuadrcula"/>
@@ -6036,10 +4672,10 @@
       </w:tblPr>
       <w:tblGrid>
         <w:gridCol w:w="1891"/>
-        <w:gridCol w:w="1772"/>
+        <w:gridCol w:w="2083"/>
         <w:gridCol w:w="1019"/>
         <w:gridCol w:w="1564"/>
-        <w:gridCol w:w="1257"/>
+        <w:gridCol w:w="1508"/>
         <w:gridCol w:w="1276"/>
       </w:tblGrid>
       <w:tr>
@@ -6052,7 +4688,7 @@
           </w:tcPr>
           <w:p>
             <w:pPr>
-              <w:spacing w:before="0" w:after="0"/>
+              <w:spacing w:after="0"/>
               <w:rPr>
                 <w:rFonts w:ascii="Calibri" w:hAnsi="Calibri" w:cs="Calibri"/>
                 <w:b/>
@@ -6077,7 +4713,7 @@
         </w:tc>
         <w:tc>
           <w:tcPr>
-            <w:tcW w:w="1626" w:type="dxa"/>
+            <w:tcW w:w="2083" w:type="dxa"/>
             <w:tcBorders>
               <w:top w:val="single" w:sz="4" w:space="0" w:color="auto"/>
               <w:left w:val="single" w:sz="4" w:space="0" w:color="auto"/>
@@ -6093,6 +4729,8 @@
                 <w:b/>
                 <w:caps/>
                 <w:noProof/>
+                <w:sz w:val="24"/>
+                <w:szCs w:val="24"/>
               </w:rPr>
             </w:pPr>
             <w:r>
@@ -6100,6 +4738,8 @@
                 <w:rFonts w:ascii="Calibri" w:hAnsi="Calibri" w:cs="Calibri"/>
                 <w:b/>
                 <w:bCs/>
+                <w:sz w:val="24"/>
+                <w:szCs w:val="24"/>
               </w:rPr>
               <w:fldChar w:fldCharType="begin"/>
             </w:r>
@@ -6108,6 +4748,8 @@
                 <w:rFonts w:ascii="Calibri" w:hAnsi="Calibri" w:cs="Calibri"/>
                 <w:b/>
                 <w:bCs/>
+                <w:sz w:val="24"/>
+                <w:szCs w:val="24"/>
               </w:rPr>
               <w:instrText xml:space="preserve"> MERGEFIELD  total_entregado  \* MERGEFORMAT </w:instrText>
             </w:r>
@@ -6116,6 +4758,8 @@
                 <w:rFonts w:ascii="Calibri" w:hAnsi="Calibri" w:cs="Calibri"/>
                 <w:b/>
                 <w:bCs/>
+                <w:sz w:val="24"/>
+                <w:szCs w:val="24"/>
               </w:rPr>
               <w:fldChar w:fldCharType="separate"/>
             </w:r>
@@ -6125,6 +4769,8 @@
                 <w:b/>
                 <w:bCs/>
                 <w:noProof/>
+                <w:sz w:val="24"/>
+                <w:szCs w:val="24"/>
               </w:rPr>
               <w:t>«total_entregado»</w:t>
             </w:r>
@@ -6133,6 +4779,8 @@
                 <w:rFonts w:ascii="Calibri" w:hAnsi="Calibri" w:cs="Calibri"/>
                 <w:b/>
                 <w:bCs/>
+                <w:sz w:val="24"/>
+                <w:szCs w:val="24"/>
               </w:rPr>
               <w:fldChar w:fldCharType="end"/>
             </w:r>
@@ -6153,6 +4801,8 @@
                 <w:b/>
                 <w:caps/>
                 <w:noProof/>
+                <w:sz w:val="22"/>
+                <w:szCs w:val="22"/>
               </w:rPr>
             </w:pPr>
             <w:r>
@@ -6161,6 +4811,8 @@
                 <w:b/>
                 <w:caps/>
                 <w:noProof/>
+                <w:sz w:val="22"/>
+                <w:szCs w:val="22"/>
               </w:rPr>
               <w:t>TMH</w:t>
             </w:r>
@@ -6172,7 +4824,7 @@
           </w:tcPr>
           <w:p>
             <w:pPr>
-              <w:spacing w:before="0" w:after="0"/>
+              <w:spacing w:after="0"/>
               <w:rPr>
                 <w:rFonts w:ascii="Calibri" w:hAnsi="Calibri" w:cs="Calibri"/>
                 <w:b/>
@@ -6195,7 +4847,7 @@
         </w:tc>
         <w:tc>
           <w:tcPr>
-            <w:tcW w:w="1158" w:type="dxa"/>
+            <w:tcW w:w="1508" w:type="dxa"/>
           </w:tcPr>
           <w:p>
             <w:pPr>
@@ -6205,6 +4857,8 @@
                 <w:b/>
                 <w:caps/>
                 <w:noProof/>
+                <w:sz w:val="28"/>
+                <w:szCs w:val="28"/>
               </w:rPr>
             </w:pPr>
             <w:r>
@@ -6212,6 +4866,8 @@
                 <w:rFonts w:ascii="Calibri" w:hAnsi="Calibri" w:cs="Calibri"/>
                 <w:b/>
                 <w:bCs/>
+                <w:sz w:val="28"/>
+                <w:szCs w:val="28"/>
               </w:rPr>
               <w:fldChar w:fldCharType="begin"/>
             </w:r>
@@ -6220,6 +4876,8 @@
                 <w:rFonts w:ascii="Calibri" w:hAnsi="Calibri" w:cs="Calibri"/>
                 <w:b/>
                 <w:bCs/>
+                <w:sz w:val="28"/>
+                <w:szCs w:val="28"/>
               </w:rPr>
               <w:instrText xml:space="preserve"> MERGEFIELD  diferencia  \* MERGEFORMAT </w:instrText>
             </w:r>
@@ -6228,6 +4886,8 @@
                 <w:rFonts w:ascii="Calibri" w:hAnsi="Calibri" w:cs="Calibri"/>
                 <w:b/>
                 <w:bCs/>
+                <w:sz w:val="28"/>
+                <w:szCs w:val="28"/>
               </w:rPr>
               <w:fldChar w:fldCharType="separate"/>
             </w:r>
@@ -6237,14 +4897,40 @@
                 <w:b/>
                 <w:bCs/>
                 <w:noProof/>
-              </w:rPr>
-              <w:t>«diferencia»</w:t>
-            </w:r>
-            <w:r>
-              <w:rPr>
-                <w:rFonts w:ascii="Calibri" w:hAnsi="Calibri" w:cs="Calibri"/>
-                <w:b/>
-                <w:bCs/>
+                <w:sz w:val="28"/>
+                <w:szCs w:val="28"/>
+              </w:rPr>
+              <w:t>«</w:t>
+            </w:r>
+            <w:r>
+              <w:rPr>
+                <w:rFonts w:ascii="Calibri" w:hAnsi="Calibri" w:cs="Calibri"/>
+                <w:b/>
+                <w:bCs/>
+                <w:noProof/>
+                <w:sz w:val="24"/>
+                <w:szCs w:val="24"/>
+              </w:rPr>
+              <w:t>diferencia</w:t>
+            </w:r>
+            <w:r>
+              <w:rPr>
+                <w:rFonts w:ascii="Calibri" w:hAnsi="Calibri" w:cs="Calibri"/>
+                <w:b/>
+                <w:bCs/>
+                <w:noProof/>
+                <w:sz w:val="28"/>
+                <w:szCs w:val="28"/>
+              </w:rPr>
+              <w:t>»</w:t>
+            </w:r>
+            <w:r>
+              <w:rPr>
+                <w:rFonts w:ascii="Calibri" w:hAnsi="Calibri" w:cs="Calibri"/>
+                <w:b/>
+                <w:bCs/>
+                <w:sz w:val="28"/>
+                <w:szCs w:val="28"/>
               </w:rPr>
               <w:fldChar w:fldCharType="end"/>
             </w:r>
@@ -6300,7 +4986,7 @@
         </w:tc>
         <w:tc>
           <w:tcPr>
-            <w:tcW w:w="1626" w:type="dxa"/>
+            <w:tcW w:w="2083" w:type="dxa"/>
             <w:tcBorders>
               <w:top w:val="single" w:sz="4" w:space="0" w:color="auto"/>
               <w:bottom w:val="single" w:sz="4" w:space="0" w:color="auto"/>
@@ -6353,7 +5039,7 @@
         </w:tc>
         <w:tc>
           <w:tcPr>
-            <w:tcW w:w="1158" w:type="dxa"/>
+            <w:tcW w:w="1508" w:type="dxa"/>
           </w:tcPr>
           <w:p>
             <w:pPr>
@@ -6423,7 +5109,7 @@
         </w:tc>
         <w:tc>
           <w:tcPr>
-            <w:tcW w:w="1626" w:type="dxa"/>
+            <w:tcW w:w="2083" w:type="dxa"/>
             <w:tcBorders>
               <w:top w:val="single" w:sz="4" w:space="0" w:color="auto"/>
               <w:left w:val="single" w:sz="4" w:space="0" w:color="auto"/>
@@ -6491,7 +5177,7 @@
         </w:tc>
         <w:tc>
           <w:tcPr>
-            <w:tcW w:w="1158" w:type="dxa"/>
+            <w:tcW w:w="1508" w:type="dxa"/>
           </w:tcPr>
           <w:p>
             <w:pPr>
@@ -6601,7 +5287,7 @@
         </w:tc>
         <w:tc>
           <w:tcPr>
-            <w:tcW w:w="1626" w:type="dxa"/>
+            <w:tcW w:w="2083" w:type="dxa"/>
             <w:tcBorders>
               <w:top w:val="single" w:sz="4" w:space="0" w:color="auto"/>
               <w:left w:val="single" w:sz="4" w:space="0" w:color="auto"/>
@@ -6710,7 +5396,7 @@
         </w:tc>
         <w:tc>
           <w:tcPr>
-            <w:tcW w:w="1158" w:type="dxa"/>
+            <w:tcW w:w="1508" w:type="dxa"/>
           </w:tcPr>
           <w:p>
             <w:pPr>
@@ -6766,16 +5452,16 @@
         <mc:AlternateContent>
           <mc:Choice Requires="wps">
             <w:drawing>
-              <wp:anchor distT="0" distB="0" distL="114300" distR="114300" simplePos="0" relativeHeight="251682816" behindDoc="1" locked="0" layoutInCell="1" allowOverlap="1" wp14:anchorId="765002FB" wp14:editId="487B699B">
+              <wp:anchor distT="0" distB="0" distL="114300" distR="114300" simplePos="0" relativeHeight="251682816" behindDoc="1" locked="0" layoutInCell="1" allowOverlap="1" wp14:anchorId="765002FB" wp14:editId="440AAE54">
                 <wp:simplePos x="0" y="0"/>
                 <wp:positionH relativeFrom="column">
-                  <wp:posOffset>2143125</wp:posOffset>
+                  <wp:posOffset>2141855</wp:posOffset>
                 </wp:positionH>
                 <wp:positionV relativeFrom="paragraph">
-                  <wp:posOffset>1914525</wp:posOffset>
+                  <wp:posOffset>1917065</wp:posOffset>
                 </wp:positionV>
-                <wp:extent cx="2934970" cy="566420"/>
-                <wp:effectExtent l="0" t="0" r="0" b="5080"/>
+                <wp:extent cx="2934970" cy="731520"/>
+                <wp:effectExtent l="0" t="0" r="0" b="0"/>
                 <wp:wrapTopAndBottom/>
                 <wp:docPr id="1233819399" name="Rectángulo 2"/>
                 <wp:cNvGraphicFramePr/>
@@ -6786,7 +5472,7 @@
                       <wps:spPr>
                         <a:xfrm>
                           <a:off x="0" y="0"/>
-                          <a:ext cx="2934970" cy="566420"/>
+                          <a:ext cx="2934970" cy="731520"/>
                         </a:xfrm>
                         <a:prstGeom prst="rect">
                           <a:avLst/>
@@ -6947,7 +5633,7 @@
           </mc:Choice>
           <mc:Fallback>
             <w:pict>
-              <v:rect w14:anchorId="765002FB" id="_x0000_s1029" style="position:absolute;margin-left:168.75pt;margin-top:150.75pt;width:231.1pt;height:44.6pt;z-index:-251633664;visibility:visible;mso-wrap-style:square;mso-width-percent:0;mso-height-percent:0;mso-wrap-distance-left:9pt;mso-wrap-distance-top:0;mso-wrap-distance-right:9pt;mso-wrap-distance-bottom:0;mso-position-horizontal:absolute;mso-position-horizontal-relative:text;mso-position-vertical:absolute;mso-position-vertical-relative:text;mso-width-percent:0;mso-height-percent:0;mso-width-relative:margin;mso-height-relative:margin;v-text-anchor:middle" o:gfxdata="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" filled="f" stroked="f">
+              <v:rect w14:anchorId="765002FB" id="_x0000_s1028" style="position:absolute;margin-left:168.65pt;margin-top:150.95pt;width:231.1pt;height:57.6pt;z-index:-251633664;visibility:visible;mso-wrap-style:square;mso-width-percent:0;mso-height-percent:0;mso-wrap-distance-left:9pt;mso-wrap-distance-top:0;mso-wrap-distance-right:9pt;mso-wrap-distance-bottom:0;mso-position-horizontal:absolute;mso-position-horizontal-relative:text;mso-position-vertical:absolute;mso-position-vertical-relative:text;mso-width-percent:0;mso-height-percent:0;mso-width-relative:margin;mso-height-relative:margin;v-text-anchor:middle" o:gfxdata="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" filled="f" stroked="f">
                 <v:textbox>
                   <w:txbxContent>
                     <w:tbl>
@@ -7082,18 +5768,18 @@
         <mc:AlternateContent>
           <mc:Choice Requires="wps">
             <w:drawing>
-              <wp:anchor distT="0" distB="0" distL="114300" distR="114300" simplePos="0" relativeHeight="251678720" behindDoc="1" locked="0" layoutInCell="1" allowOverlap="1" wp14:anchorId="370B154C" wp14:editId="7F64F941">
+              <wp:anchor distT="0" distB="0" distL="114300" distR="114300" simplePos="0" relativeHeight="251680768" behindDoc="1" locked="0" layoutInCell="1" allowOverlap="1" wp14:anchorId="3B26C10D" wp14:editId="42966533">
                 <wp:simplePos x="0" y="0"/>
                 <wp:positionH relativeFrom="column">
-                  <wp:posOffset>333375</wp:posOffset>
+                  <wp:posOffset>3799840</wp:posOffset>
                 </wp:positionH>
                 <wp:positionV relativeFrom="paragraph">
-                  <wp:posOffset>666750</wp:posOffset>
+                  <wp:posOffset>667385</wp:posOffset>
                 </wp:positionV>
-                <wp:extent cx="2934970" cy="566420"/>
+                <wp:extent cx="2934970" cy="1023620"/>
                 <wp:effectExtent l="0" t="0" r="0" b="5080"/>
                 <wp:wrapTopAndBottom/>
-                <wp:docPr id="2116462633" name="Rectángulo 2"/>
+                <wp:docPr id="606034837" name="Rectángulo 2"/>
                 <wp:cNvGraphicFramePr/>
                 <a:graphic xmlns:a="http://schemas.openxmlformats.org/drawingml/2006/main">
                   <a:graphicData uri="http://schemas.microsoft.com/office/word/2010/wordprocessingShape">
@@ -7102,7 +5788,7 @@
                       <wps:spPr>
                         <a:xfrm>
                           <a:off x="0" y="0"/>
-                          <a:ext cx="2934970" cy="566420"/>
+                          <a:ext cx="2934970" cy="1023620"/>
                         </a:xfrm>
                         <a:prstGeom prst="rect">
                           <a:avLst/>
@@ -7204,7 +5890,37 @@
                                       <w:sz w:val="16"/>
                                       <w:szCs w:val="16"/>
                                     </w:rPr>
-                                    <w:t>Jefe de Guardia (Planta de Procesos)</w:t>
+                                    <w:t>Agente</w:t>
+                                  </w:r>
+                                  <w:r>
+                                    <w:rPr>
+                                      <w:rFonts w:ascii="Calibri" w:hAnsi="Calibri" w:cs="Calibri"/>
+                                      <w:b/>
+                                      <w:bCs/>
+                                      <w:sz w:val="16"/>
+                                      <w:szCs w:val="16"/>
+                                    </w:rPr>
+                                    <w:t xml:space="preserve"> (</w:t>
+                                  </w:r>
+                                  <w:r>
+                                    <w:rPr>
+                                      <w:rFonts w:ascii="Calibri" w:hAnsi="Calibri" w:cs="Calibri"/>
+                                      <w:b/>
+                                      <w:bCs/>
+                                      <w:sz w:val="16"/>
+                                      <w:szCs w:val="16"/>
+                                    </w:rPr>
+                                    <w:t>Seguridad Patrimonial</w:t>
+                                  </w:r>
+                                  <w:r>
+                                    <w:rPr>
+                                      <w:rFonts w:ascii="Calibri" w:hAnsi="Calibri" w:cs="Calibri"/>
+                                      <w:b/>
+                                      <w:bCs/>
+                                      <w:sz w:val="16"/>
+                                      <w:szCs w:val="16"/>
+                                    </w:rPr>
+                                    <w:t>)</w:t>
                                   </w:r>
                                 </w:p>
                               </w:tc>
@@ -7233,7 +5949,7 @@
           </mc:Choice>
           <mc:Fallback>
             <w:pict>
-              <v:rect w14:anchorId="370B154C" id="_x0000_s1030" style="position:absolute;margin-left:26.25pt;margin-top:52.5pt;width:231.1pt;height:44.6pt;z-index:-251637760;visibility:visible;mso-wrap-style:square;mso-width-percent:0;mso-height-percent:0;mso-wrap-distance-left:9pt;mso-wrap-distance-top:0;mso-wrap-distance-right:9pt;mso-wrap-distance-bottom:0;mso-position-horizontal:absolute;mso-position-horizontal-relative:text;mso-position-vertical:absolute;mso-position-vertical-relative:text;mso-width-percent:0;mso-height-percent:0;mso-width-relative:margin;mso-height-relative:margin;v-text-anchor:middle" o:gfxdata="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" filled="f" stroked="f">
+              <v:rect w14:anchorId="3B26C10D" id="_x0000_s1029" style="position:absolute;margin-left:299.2pt;margin-top:52.55pt;width:231.1pt;height:80.6pt;z-index:-251635712;visibility:visible;mso-wrap-style:square;mso-width-percent:0;mso-height-percent:0;mso-wrap-distance-left:9pt;mso-wrap-distance-top:0;mso-wrap-distance-right:9pt;mso-wrap-distance-bottom:0;mso-position-horizontal:absolute;mso-position-horizontal-relative:text;mso-position-vertical:absolute;mso-position-vertical-relative:text;mso-width-percent:0;mso-height-percent:0;mso-width-relative:margin;mso-height-relative:margin;v-text-anchor:middle" o:gfxdata="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" filled="f" stroked="f">
                 <v:textbox>
                   <w:txbxContent>
                     <w:tbl>
@@ -7312,7 +6028,37 @@
                                 <w:sz w:val="16"/>
                                 <w:szCs w:val="16"/>
                               </w:rPr>
-                              <w:t>Jefe de Guardia (Planta de Procesos)</w:t>
+                              <w:t>Agente</w:t>
+                            </w:r>
+                            <w:r>
+                              <w:rPr>
+                                <w:rFonts w:ascii="Calibri" w:hAnsi="Calibri" w:cs="Calibri"/>
+                                <w:b/>
+                                <w:bCs/>
+                                <w:sz w:val="16"/>
+                                <w:szCs w:val="16"/>
+                              </w:rPr>
+                              <w:t xml:space="preserve"> (</w:t>
+                            </w:r>
+                            <w:r>
+                              <w:rPr>
+                                <w:rFonts w:ascii="Calibri" w:hAnsi="Calibri" w:cs="Calibri"/>
+                                <w:b/>
+                                <w:bCs/>
+                                <w:sz w:val="16"/>
+                                <w:szCs w:val="16"/>
+                              </w:rPr>
+                              <w:t>Seguridad Patrimonial</w:t>
+                            </w:r>
+                            <w:r>
+                              <w:rPr>
+                                <w:rFonts w:ascii="Calibri" w:hAnsi="Calibri" w:cs="Calibri"/>
+                                <w:b/>
+                                <w:bCs/>
+                                <w:sz w:val="16"/>
+                                <w:szCs w:val="16"/>
+                              </w:rPr>
+                              <w:t>)</w:t>
                             </w:r>
                           </w:p>
                         </w:tc>
@@ -7338,18 +6084,18 @@
         <mc:AlternateContent>
           <mc:Choice Requires="wps">
             <w:drawing>
-              <wp:anchor distT="0" distB="0" distL="114300" distR="114300" simplePos="0" relativeHeight="251680768" behindDoc="1" locked="0" layoutInCell="1" allowOverlap="1" wp14:anchorId="3B26C10D" wp14:editId="1558C5A4">
+              <wp:anchor distT="0" distB="0" distL="114300" distR="114300" simplePos="0" relativeHeight="251678720" behindDoc="1" locked="0" layoutInCell="1" allowOverlap="1" wp14:anchorId="370B154C" wp14:editId="3AF55E3C">
                 <wp:simplePos x="0" y="0"/>
                 <wp:positionH relativeFrom="column">
-                  <wp:posOffset>3800475</wp:posOffset>
+                  <wp:posOffset>331470</wp:posOffset>
                 </wp:positionH>
                 <wp:positionV relativeFrom="paragraph">
-                  <wp:posOffset>666750</wp:posOffset>
+                  <wp:posOffset>667385</wp:posOffset>
                 </wp:positionV>
-                <wp:extent cx="2934970" cy="566420"/>
-                <wp:effectExtent l="0" t="0" r="0" b="5080"/>
+                <wp:extent cx="2934970" cy="981075"/>
+                <wp:effectExtent l="0" t="0" r="0" b="9525"/>
                 <wp:wrapTopAndBottom/>
-                <wp:docPr id="606034837" name="Rectángulo 2"/>
+                <wp:docPr id="2116462633" name="Rectángulo 2"/>
                 <wp:cNvGraphicFramePr/>
                 <a:graphic xmlns:a="http://schemas.openxmlformats.org/drawingml/2006/main">
                   <a:graphicData uri="http://schemas.microsoft.com/office/word/2010/wordprocessingShape">
@@ -7358,7 +6104,7 @@
                       <wps:spPr>
                         <a:xfrm>
                           <a:off x="0" y="0"/>
-                          <a:ext cx="2934970" cy="566420"/>
+                          <a:ext cx="2934970" cy="981075"/>
                         </a:xfrm>
                         <a:prstGeom prst="rect">
                           <a:avLst/>
@@ -7460,37 +6206,7 @@
                                       <w:sz w:val="16"/>
                                       <w:szCs w:val="16"/>
                                     </w:rPr>
-                                    <w:t>Agente</w:t>
-                                  </w:r>
-                                  <w:r>
-                                    <w:rPr>
-                                      <w:rFonts w:ascii="Calibri" w:hAnsi="Calibri" w:cs="Calibri"/>
-                                      <w:b/>
-                                      <w:bCs/>
-                                      <w:sz w:val="16"/>
-                                      <w:szCs w:val="16"/>
-                                    </w:rPr>
-                                    <w:t xml:space="preserve"> (</w:t>
-                                  </w:r>
-                                  <w:r>
-                                    <w:rPr>
-                                      <w:rFonts w:ascii="Calibri" w:hAnsi="Calibri" w:cs="Calibri"/>
-                                      <w:b/>
-                                      <w:bCs/>
-                                      <w:sz w:val="16"/>
-                                      <w:szCs w:val="16"/>
-                                    </w:rPr>
-                                    <w:t>Seguridad Patrimonial</w:t>
-                                  </w:r>
-                                  <w:r>
-                                    <w:rPr>
-                                      <w:rFonts w:ascii="Calibri" w:hAnsi="Calibri" w:cs="Calibri"/>
-                                      <w:b/>
-                                      <w:bCs/>
-                                      <w:sz w:val="16"/>
-                                      <w:szCs w:val="16"/>
-                                    </w:rPr>
-                                    <w:t>)</w:t>
+                                    <w:t>Jefe de Guardia (Planta de Procesos)</w:t>
                                   </w:r>
                                 </w:p>
                               </w:tc>
@@ -7519,7 +6235,7 @@
           </mc:Choice>
           <mc:Fallback>
             <w:pict>
-              <v:rect w14:anchorId="3B26C10D" id="_x0000_s1031" style="position:absolute;margin-left:299.25pt;margin-top:52.5pt;width:231.1pt;height:44.6pt;z-index:-251635712;visibility:visible;mso-wrap-style:square;mso-width-percent:0;mso-height-percent:0;mso-wrap-distance-left:9pt;mso-wrap-distance-top:0;mso-wrap-distance-right:9pt;mso-wrap-distance-bottom:0;mso-position-horizontal:absolute;mso-position-horizontal-relative:text;mso-position-vertical:absolute;mso-position-vertical-relative:text;mso-width-percent:0;mso-height-percent:0;mso-width-relative:margin;mso-height-relative:margin;v-text-anchor:middle" o:gfxdata="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" filled="f" stroked="f">
+              <v:rect w14:anchorId="370B154C" id="_x0000_s1030" style="position:absolute;margin-left:26.1pt;margin-top:52.55pt;width:231.1pt;height:77.25pt;z-index:-251637760;visibility:visible;mso-wrap-style:square;mso-width-percent:0;mso-height-percent:0;mso-wrap-distance-left:9pt;mso-wrap-distance-top:0;mso-wrap-distance-right:9pt;mso-wrap-distance-bottom:0;mso-position-horizontal:absolute;mso-position-horizontal-relative:text;mso-position-vertical:absolute;mso-position-vertical-relative:text;mso-width-percent:0;mso-height-percent:0;mso-width-relative:margin;mso-height-relative:margin;v-text-anchor:middle" o:gfxdata="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" filled="f" stroked="f">
                 <v:textbox>
                   <w:txbxContent>
                     <w:tbl>
@@ -7598,37 +6314,7 @@
                                 <w:sz w:val="16"/>
                                 <w:szCs w:val="16"/>
                               </w:rPr>
-                              <w:t>Agente</w:t>
-                            </w:r>
-                            <w:r>
-                              <w:rPr>
-                                <w:rFonts w:ascii="Calibri" w:hAnsi="Calibri" w:cs="Calibri"/>
-                                <w:b/>
-                                <w:bCs/>
-                                <w:sz w:val="16"/>
-                                <w:szCs w:val="16"/>
-                              </w:rPr>
-                              <w:t xml:space="preserve"> (</w:t>
-                            </w:r>
-                            <w:r>
-                              <w:rPr>
-                                <w:rFonts w:ascii="Calibri" w:hAnsi="Calibri" w:cs="Calibri"/>
-                                <w:b/>
-                                <w:bCs/>
-                                <w:sz w:val="16"/>
-                                <w:szCs w:val="16"/>
-                              </w:rPr>
-                              <w:t>Seguridad Patrimonial</w:t>
-                            </w:r>
-                            <w:r>
-                              <w:rPr>
-                                <w:rFonts w:ascii="Calibri" w:hAnsi="Calibri" w:cs="Calibri"/>
-                                <w:b/>
-                                <w:bCs/>
-                                <w:sz w:val="16"/>
-                                <w:szCs w:val="16"/>
-                              </w:rPr>
-                              <w:t>)</w:t>
+                              <w:t>Jefe de Guardia (Planta de Procesos)</w:t>
                             </w:r>
                           </w:p>
                         </w:tc>

</xml_diff>